<commit_message>
Report: new admin dashboard screenshots and description; refreshed E2E report screens
Co-Authored-By: Claude Sonnet 5.5 <noreply@anthropic.com>
</commit_message>
<xml_diff>
--- a/docs/ปัญหาพิเศษ_KU_VIN_ฉบับปรับปรุง.docx
+++ b/docs/ปัญหาพิเศษ_KU_VIN_ฉบับปรับปรุง.docx
@@ -16610,7 +16610,7 @@
         <w:lastRenderedPageBreak/>
         <w:drawing>
           <wp:inline distT="0" distB="0" distL="0" distR="0" wp14:anchorId="1C1950E5" wp14:editId="1241157F">
-            <wp:extent cx="1695450" cy="5667375"/>
+            <wp:extent cx="1695450" cy="5662250"/>
             <wp:effectExtent l="0" t="0" r="0" b="0"/>
             <wp:docPr id="1215703207" name="รูปภาพ 1215703207"/>
             <wp:cNvGraphicFramePr>
@@ -16635,7 +16635,7 @@
                   <pic:spPr bwMode="auto">
                     <a:xfrm>
                       <a:off x="0" y="0"/>
-                      <a:ext cx="1695450" cy="5667375"/>
+                      <a:ext cx="1695450" cy="5662250"/>
                     </a:xfrm>
                     <a:prstGeom prst="rect">
                       <a:avLst/>
@@ -23305,7 +23305,7 @@
         </w:rPr>
         <w:drawing>
           <wp:inline distT="0" distB="0" distL="0" distR="0" wp14:anchorId="65E2545E" wp14:editId="36CB92EF">
-            <wp:extent cx="5486400" cy="4076700"/>
+            <wp:extent cx="5486400" cy="4079810"/>
             <wp:effectExtent l="0" t="0" r="0" b="0"/>
             <wp:docPr id="2065890384" name="รูปภาพ 2065890384"/>
             <wp:cNvGraphicFramePr>
@@ -23330,7 +23330,7 @@
                   <pic:spPr bwMode="auto">
                     <a:xfrm>
                       <a:off x="0" y="0"/>
-                      <a:ext cx="5486400" cy="4076700"/>
+                      <a:ext cx="5486400" cy="4079810"/>
                     </a:xfrm>
                     <a:prstGeom prst="rect">
                       <a:avLst/>
@@ -23422,7 +23422,7 @@
         <w:lastRenderedPageBreak/>
         <w:drawing>
           <wp:inline distT="0" distB="0" distL="0" distR="0" wp14:anchorId="3AD0AD2C" wp14:editId="72903C5C">
-            <wp:extent cx="2486025" cy="6677025"/>
+            <wp:extent cx="2486025" cy="6685900"/>
             <wp:effectExtent l="0" t="0" r="0" b="0"/>
             <wp:docPr id="1512891114" name="รูปภาพ 1512891114"/>
             <wp:cNvGraphicFramePr>
@@ -23447,7 +23447,7 @@
                   <pic:spPr bwMode="auto">
                     <a:xfrm>
                       <a:off x="0" y="0"/>
-                      <a:ext cx="2486025" cy="6677025"/>
+                      <a:ext cx="2486025" cy="6685900"/>
                     </a:xfrm>
                     <a:prstGeom prst="rect">
                       <a:avLst/>
@@ -23520,7 +23520,7 @@
         </w:rPr>
         <w:drawing>
           <wp:inline distT="0" distB="0" distL="0" distR="0" wp14:anchorId="22688B49" wp14:editId="1FB43EB9">
-            <wp:extent cx="5486400" cy="5305425"/>
+            <wp:extent cx="5486400" cy="5304453"/>
             <wp:effectExtent l="0" t="0" r="0" b="0"/>
             <wp:docPr id="1098822921" name="รูปภาพ 1098822921"/>
             <wp:cNvGraphicFramePr>
@@ -23545,7 +23545,7 @@
                   <pic:spPr bwMode="auto">
                     <a:xfrm>
                       <a:off x="0" y="0"/>
-                      <a:ext cx="5486400" cy="5305425"/>
+                      <a:ext cx="5486400" cy="5304453"/>
                     </a:xfrm>
                     <a:prstGeom prst="rect">
                       <a:avLst/>
@@ -24124,7 +24124,7 @@
         <w:lastRenderedPageBreak/>
         <w:drawing>
           <wp:inline distT="0" distB="0" distL="0" distR="0" wp14:anchorId="60D6F275" wp14:editId="312055A3">
-            <wp:extent cx="5486400" cy="6076950"/>
+            <wp:extent cx="5486400" cy="6081226"/>
             <wp:effectExtent l="0" t="0" r="0" b="0"/>
             <wp:docPr id="1325801344" name="รูปภาพ 1325801344"/>
             <wp:cNvGraphicFramePr>
@@ -24149,7 +24149,7 @@
                   <pic:spPr bwMode="auto">
                     <a:xfrm>
                       <a:off x="0" y="0"/>
-                      <a:ext cx="5486400" cy="6076950"/>
+                      <a:ext cx="5486400" cy="6081226"/>
                     </a:xfrm>
                     <a:prstGeom prst="rect">
                       <a:avLst/>
@@ -24219,7 +24219,7 @@
         <w:lastRenderedPageBreak/>
         <w:drawing>
           <wp:inline distT="0" distB="0" distL="0" distR="0" wp14:anchorId="40820D9B" wp14:editId="5850C069">
-            <wp:extent cx="5486400" cy="5657850"/>
+            <wp:extent cx="5486400" cy="5654351"/>
             <wp:effectExtent l="0" t="0" r="0" b="0"/>
             <wp:docPr id="656042634" name="รูปภาพ 656042634"/>
             <wp:cNvGraphicFramePr>
@@ -24244,7 +24244,7 @@
                   <pic:spPr bwMode="auto">
                     <a:xfrm>
                       <a:off x="0" y="0"/>
-                      <a:ext cx="5486400" cy="5657850"/>
+                      <a:ext cx="5486400" cy="5654351"/>
                     </a:xfrm>
                     <a:prstGeom prst="rect">
                       <a:avLst/>
@@ -24291,7 +24291,7 @@
         <w:lastRenderedPageBreak/>
         <w:drawing>
           <wp:inline distT="0" distB="0" distL="0" distR="0" wp14:anchorId="2CF25277" wp14:editId="67525C4C">
-            <wp:extent cx="5486400" cy="4171950"/>
+            <wp:extent cx="5486400" cy="4170783"/>
             <wp:effectExtent l="0" t="0" r="0" b="0"/>
             <wp:docPr id="172308720" name="รูปภาพ 172308720"/>
             <wp:cNvGraphicFramePr>
@@ -24316,7 +24316,7 @@
                   <pic:spPr bwMode="auto">
                     <a:xfrm>
                       <a:off x="0" y="0"/>
-                      <a:ext cx="5486400" cy="4171950"/>
+                      <a:ext cx="5486400" cy="4170783"/>
                     </a:xfrm>
                     <a:prstGeom prst="rect">
                       <a:avLst/>
@@ -24388,7 +24388,7 @@
         </w:rPr>
         <w:drawing>
           <wp:inline distT="0" distB="0" distL="0" distR="0" wp14:anchorId="5DABAADF" wp14:editId="1DC70FFF">
-            <wp:extent cx="5486400" cy="781050"/>
+            <wp:extent cx="5486400" cy="783771"/>
             <wp:effectExtent l="0" t="0" r="0" b="0"/>
             <wp:docPr id="1637755047" name="รูปภาพ 1637755047"/>
             <wp:cNvGraphicFramePr>
@@ -24413,7 +24413,7 @@
                   <pic:spPr bwMode="auto">
                     <a:xfrm>
                       <a:off x="0" y="0"/>
-                      <a:ext cx="5486400" cy="781050"/>
+                      <a:ext cx="5486400" cy="783771"/>
                     </a:xfrm>
                     <a:prstGeom prst="rect">
                       <a:avLst/>
@@ -24486,7 +24486,7 @@
         <w:lastRenderedPageBreak/>
         <w:drawing>
           <wp:inline distT="0" distB="0" distL="0" distR="0" wp14:anchorId="78BD5B16" wp14:editId="135C56B4">
-            <wp:extent cx="5486400" cy="4943475"/>
+            <wp:extent cx="5486400" cy="4947557"/>
             <wp:effectExtent l="0" t="0" r="0" b="0"/>
             <wp:docPr id="2117811005" name="รูปภาพ 2117811005"/>
             <wp:cNvGraphicFramePr>
@@ -24511,7 +24511,7 @@
                   <pic:spPr bwMode="auto">
                     <a:xfrm>
                       <a:off x="0" y="0"/>
-                      <a:ext cx="5486400" cy="4943475"/>
+                      <a:ext cx="5486400" cy="4947557"/>
                     </a:xfrm>
                     <a:prstGeom prst="rect">
                       <a:avLst/>
@@ -25573,7 +25573,7 @@
         </w:rPr>
         <w:drawing>
           <wp:inline distT="0" distB="0" distL="0" distR="0" wp14:anchorId="5876E6AB" wp14:editId="647C1F90">
-            <wp:extent cx="5486400" cy="590550"/>
+            <wp:extent cx="5486400" cy="587828"/>
             <wp:effectExtent l="0" t="0" r="0" b="0"/>
             <wp:docPr id="454539987" name="รูปภาพ 454539987"/>
             <wp:cNvGraphicFramePr>
@@ -25598,7 +25598,7 @@
                   <pic:spPr bwMode="auto">
                     <a:xfrm>
                       <a:off x="0" y="0"/>
-                      <a:ext cx="5486400" cy="590550"/>
+                      <a:ext cx="5486400" cy="587828"/>
                     </a:xfrm>
                     <a:prstGeom prst="rect">
                       <a:avLst/>
@@ -33599,7 +33599,7 @@
         <w:rPr>
           <w:cs/>
         </w:rPr>
-        <w:t>หน้าภาพรวมแสดงสถานะของระบบ ณ ปัจจุบัน ประกอบด้วย</w:t>
+        <w:t>หน้าภาพรวมออกแบบเป็นคิวงานที่ต้องจัดการ เรียงตามความเร่งด่วน ประกอบด้วย</w:t>
       </w:r>
     </w:p>
     <w:p>
@@ -33615,7 +33615,7 @@
         <w:rPr>
           <w:cs/>
         </w:rPr>
-        <w:t>สถิติทริปวันนี้ รายได้วันนี้ คนขับออนไลน์ คนขับที่อนุมัติแล้ว และข้อพิพาทที่ค้างอยู่</w:t>
+        <w:t>แถบตัวเลขสรุปวันนี้ ได้แก่ ทริปวันนี้ รายได้วันนี้ คนขับออนไลน์ และคนขับที่อนุมัติแล้ว</w:t>
       </w:r>
     </w:p>
     <w:p>
@@ -33631,7 +33631,7 @@
         <w:rPr>
           <w:cs/>
         </w:rPr>
-        <w:t>รายการผู้ขับขี่ที่รออนุมัติ พร้อมเอกสารยืนยันตัวตน ปุ่มอนุมัติ และปุ่มปฏิเสธพร้อมระบุเหตุผล</w:t>
+        <w:t>แท็บคิวงาน 5 แท็บ ได้แก่ เหตุฉุกเฉิน แจ้งปัญหาหลังทริป รออนุมัติคนขับ ข้อพิพาทการจ่ายเงิน และรายการเดินทางทั้งหมด พร้อมป้ายนับจำนวนงานค้าง ระบบเปิดแท็บที่เร่งด่วนที่สุดที่มีงานค้างให้เอง</w:t>
       </w:r>
     </w:p>
     <w:p>
@@ -33647,7 +33647,7 @@
         <w:rPr>
           <w:cs/>
         </w:rPr>
-        <w:t>รายการเดินทางทั้งหมดและการแก้ไขข้อพิพาทการชำระเงิน</w:t>
+        <w:t>คนขับรออนุมัติ กรองตามประเภท (นิสิต บุคคลทั่วไป วินมอเตอร์ไซค์) แล้วกด "ตรวจสอบ" เพื่อดูเอกสารทั้งชุดในแผงด้านข้าง พร้อมปุ่มอนุมัติและปุ่มปฏิเสธที่ต้องระบุเหตุผล</w:t>
       </w:r>
     </w:p>
     <w:p>
@@ -33663,7 +33663,7 @@
         <w:rPr>
           <w:cs/>
         </w:rPr>
-        <w:t>การแจ้งเหตุฉุกเฉินที่แสดงแบบเรียลไทม์ พร้อมพิกัดของผู้แจ้ง และการปิดเหตุพร้อมบันทึกการดำเนินการ</w:t>
+        <w:t>เหตุฉุกเฉินที่แสดงแบบเรียลไทม์พร้อมพิกัดของผู้แจ้ง เรื่องแจ้งปัญหาหลังทริปที่กดขยายดูรายละเอียดและปิดเคสพร้อมบันทึกการจัดการ และรายการเดินทางที่ค้นหาและกรองตามสถานะได้</w:t>
       </w:r>
     </w:p>
     <w:p>

</xml_diff>

<commit_message>
Report v3: KUVIN name, campus wording, new cover logo, latest test numbers (139 API / 28 E2E / 80.85% coverage), profile photo, push notifications, install channels, Hostinger
Co-Authored-By: Claude Sonnet 5.5 <noreply@anthropic.com>
</commit_message>
<xml_diff>
--- a/docs/ปัญหาพิเศษ_KU_VIN_ฉบับปรับปรุง.docx
+++ b/docs/ปัญหาพิเศษ_KU_VIN_ฉบับปรับปรุง.docx
@@ -94,7 +94,7 @@
           <w:szCs w:val="40"/>
           <w:cs/>
         </w:rPr>
-        <w:t>วิทยาเขตกำแพงแสน ผ่าน KU VIN</w:t>
+        <w:t>วิทยาเขตกำแพงแสน ผ่าน KUVIN</w:t>
       </w:r>
     </w:p>
     <w:p>
@@ -122,7 +122,7 @@
           <w:sz w:val="40"/>
           <w:szCs w:val="40"/>
         </w:rPr>
-        <w:t>Kamphaeng Saen Campus via KU VIN</w:t>
+        <w:t>Kamphaeng Saen Campus via KUVIN</w:t>
       </w:r>
     </w:p>
     <w:p/>
@@ -367,7 +367,7 @@
           <w:cs/>
         </w:rPr>
         <w:tab/>
-        <w:t>ระบบเรียกวินมอเตอร์ไซค์ภายในมหาวิทยาลัยเกษตรศาสตร์ วิทยาเขตกำแพงแสน ผ่าน KU VIN</w:t>
+        <w:t>ระบบเรียกวินมอเตอร์ไซค์ภายในมหาวิทยาลัยเกษตรศาสตร์ วิทยาเขตกำแพงแสน ผ่าน KUVIN</w:t>
       </w:r>
     </w:p>
     <w:p>
@@ -378,7 +378,7 @@
       </w:pPr>
       <w:r>
         <w:tab/>
-        <w:t>Motorcycle Taxi Booking System for Kasetsart University Kamphaeng Saen Campus via KU VIN</w:t>
+        <w:t>Motorcycle Taxi Booking System for Kasetsart University Kamphaeng Saen Campus via KUVIN</w:t>
       </w:r>
     </w:p>
     <w:p>
@@ -567,7 +567,7 @@
           <w:szCs w:val="40"/>
           <w:cs/>
         </w:rPr>
-        <w:t>วิทยาเขตกำแพงแสน ผ่าน KU VIN</w:t>
+        <w:t>วิทยาเขตกำแพงแสน ผ่าน KUVIN</w:t>
       </w:r>
     </w:p>
     <w:p>
@@ -595,7 +595,7 @@
           <w:sz w:val="40"/>
           <w:szCs w:val="40"/>
         </w:rPr>
-        <w:t>Kamphaeng Saen Campus via KU VIN</w:t>
+        <w:t>Kamphaeng Saen Campus via KUVIN</w:t>
       </w:r>
     </w:p>
     <w:p/>
@@ -703,6 +703,9 @@
       <w:pPr>
         <w:sectPr>
           <w:headerReference w:type="default" r:id="rId8"/>
+          <w:footerReference w:type="default" r:id="rId78"/>
+          <w:headerReference w:type="first" r:id="rId79"/>
+          <w:footerReference w:type="first" r:id="rId80"/>
           <w:pgSz w:w="12240" w:h="15840"/>
           <w:pgMar w:top="2155" w:right="1418" w:bottom="1418" w:left="2155" w:header="708" w:footer="708" w:gutter="0"/>
           <w:cols w:space="720"/>
@@ -772,7 +775,7 @@
         <w:rPr>
           <w:cs/>
         </w:rPr>
-        <w:t>ระบบเรียกวินมอเตอร์ไซค์ภายในมหาวิทยาลัยเกษตรศาสตร์ วิทยาเขตกำแพงแสน ผ่าน KU VIN</w:t>
+        <w:t>ระบบเรียกวินมอเตอร์ไซค์ภายในมหาวิทยาลัยเกษตรศาสตร์ วิทยาเขตกำแพงแสน ผ่าน KUVIN</w:t>
       </w:r>
     </w:p>
     <w:p>
@@ -868,7 +871,7 @@
         <w:rPr>
           <w:cs/>
         </w:rPr>
-        <w:t>ปัญหาพิเศษนี้มีวัตถุประสงค์เพื่อพัฒนาระบบเรียกวินมอเตอร์ไซค์ภายในมหาวิทยาลัยเกษตรศาสตร์ วิทยาเขตกำแพงแสน ผ่าน KU VIN เป็นระบบกลางที่เชื่อมต่อนิสิต บุคลากร และผู้มาติดต่อ เข้ากับผู้ขับขี่วินรถจักรยานยนต์ แทนการโทรศัพท์ติดต่อวินโดยตรงซึ่งไม่ทราบตำแหน่งรถ เวลารอ และไม่มีประวัติการเดินทาง</w:t>
+        <w:t>ปัญหาพิเศษนี้มีวัตถุประสงค์เพื่อพัฒนาระบบเรียกวินมอเตอร์ไซค์ภายในมหาวิทยาลัยเกษตรศาสตร์ วิทยาเขตกำแพงแสน ผ่าน KUVIN เป็นระบบกลางที่เชื่อมต่อนิสิต บุคลากร และผู้มาติดต่อ เข้ากับผู้ขับขี่วินรถจักรยานยนต์ แทนการโทรศัพท์ติดต่อวินโดยตรงซึ่งไม่ทราบตำแหน่งรถ เวลารอ และไม่มีประวัติการเดินทาง</w:t>
       </w:r>
     </w:p>
     <w:p>
@@ -880,7 +883,7 @@
         <w:rPr>
           <w:cs/>
         </w:rPr>
-        <w:t>ระบบประกอบด้วยแอปพลิเคชันสำหรับผู้ใช้บริการและผู้ขับขี่ที่พัฒนาด้วย React และสร้างเป็นแอป Android ด้วย Capacitor, Web Dashboard สำหรับผู้ดูแลระบบ และ REST API ที่พัฒนาด้วย Node.js, Express และ Prisma บนฐานข้อมูล PostgreSQL โดยใช้ Socket.IO ส่งสถานะแบบเรียลไทม์ ความสามารถหลัก ได้แก่ การคำนวณค่าโดยสารตามพื้นที่ การเสนองานให้ผู้ขับขี่ตามลำดับคิว การติดตามตำแหน่งผู้ขับขี่ การชำระเงินสดหรือพร้อมเพย์พร้อมตรวจสลิปอัตโนมัติ การให้คะแนน การแจ้งเหตุฉุกเฉิน และการบันทึกรายรับรายจ่ายของผู้ขับขี่ โดยออกแบบส่วนติดต่อผู้ใ</w:t>
+        <w:t>ระบบประกอบด้วยแอปพลิเคชันสำหรับผู้ใช้บริการและผู้ขับขี่ที่พัฒนาด้วย React และสร้างเป็นแอป Android ด้วย Capacitor, Web Dashboard สำหรับผู้ดูแลระบบ และ REST API ที่พัฒนาด้วย Node.js, Express และ Prisma บนฐานข้อมูล PostgreSQL โดยใช้ Socket.IO ส่งสถานะแบบเรียลไทม์ ความสามารถหลัก ได้แก่ การคำนวณค่าโดยสารตามวิทยาเขต การเสนองานให้ผู้ขับขี่ตามลำดับคิว การติดตามตำแหน่งผู้ขับขี่ การชำระเงินสดหรือพร้อมเพย์พร้อมตรวจสลิปอัตโนมัติ การให้คะแนน การแจ้งเหตุฉุกเฉิน และการบันทึกรายรับรายจ่ายของผู้ขับขี่ โดยออกแบบส่วนติดต่อผู้ใ</w:t>
       </w:r>
       <w:r>
         <w:rPr>
@@ -898,14 +901,7 @@
         <w:rPr>
           <w:cs/>
         </w:rPr>
-        <w:t xml:space="preserve">ชุดทดสอบอัตโนมัติ 5 ชุด รวม 91 กรณี ที่รันกับฐานข้อมูลจริงผ่าน GitHub Actions ผ่านทุกกรณี และระบบติดตั้งใช้งานจริงบน Railway แล้ว ผลการประเมินความพึงพอใจของผู้ใช้งานพบว่า </w:t>
-      </w:r>
-      <w:r>
-        <w:rPr>
-          <w:highlight w:val="yellow"/>
-          <w:cs/>
-        </w:rPr>
-        <w:t>[สรุปผลการประเมินความพึงพอใจและคะแนน SUS หลังทำ UAT]</w:t>
+        <w:t>ชุดทดสอบอัตโนมัติของ API 10 ชุด รวม 139 กรณี และชุดทดสอบปลายทางถึงปลายทางผ่านเบราว์เซอร์ 28 กรณี ผ่านทุกกรณี ค่าครอบคลุมของโค้ด API 80.85% และระบบติดตั้งใช้งานจริงบน VPS ของ Hostinger (https://kuvinn.tech) ทั้งเว็บแอป แอป Android และแจ้งเตือนเด้งบนมือถือ ผลการประเมินความพึงพอใจของผู้ใช้งานพบว่า [สรุปผลการประเมินความพึงพอใจและคะแนน SUS หลังทำ UAT]</w:t>
       </w:r>
     </w:p>
     <w:p>
@@ -1021,7 +1017,7 @@
         <w:tab/>
       </w:r>
       <w:r>
-        <w:t>Motorcycle Taxi Booking System for Kasetsart University Kamphaeng Saen Campus via KU VIN</w:t>
+        <w:t>Motorcycle Taxi Booking System for Kasetsart University Kamphaeng Saen Campus via KUVIN</w:t>
       </w:r>
     </w:p>
     <w:p>
@@ -1107,7 +1103,7 @@
         <w:jc w:val="thaiDistribute"/>
       </w:pPr>
       <w:r>
-        <w:t>This special problem develops KU VIN, a motorcycle taxi booking system for Kasetsart University, Kamphaeng Saen Campus, that connects students, staff and visitors with registered drivers. It replaces booking by telephone, where passengers cannot see where the taxi is, how long they will wait, or keep a record of their trips.</w:t>
+        <w:t>This special problem develops KUVIN, a motorcycle taxi booking system for Kasetsart University, Kamphaeng Saen Campus, that connects students, staff and visitors with registered drivers. It replaces booking by telephone, where passengers cannot see where the taxi is, how long they will wait, or keep a record of their trips.</w:t>
       </w:r>
     </w:p>
     <w:p>
@@ -1128,16 +1124,7 @@
         <w:jc w:val="thaiDistribute"/>
       </w:pPr>
       <w:r>
-        <w:t xml:space="preserve">All 91 cases in five automated test suites, run against a real database in GitHub Actions, passed, and the system runs in production on Railway. The user satisfaction evaluation found that </w:t>
-      </w:r>
-      <w:r>
-        <w:rPr>
-          <w:highlight w:val="yellow"/>
-        </w:rPr>
-        <w:t>[summary of the UAT satisfaction and SUS results]</w:t>
-      </w:r>
-      <w:r>
-        <w:t>.</w:t>
+        <w:t>All 139 cases in ten automated API test suites and 28 end-to-end browser cases passed, API code coverage is 80.85%, and the system runs in production on a Hostinger VPS (https://kuvinn.tech) as a web app, an Android app and mobile push notifications. The user satisfaction evaluation found that [summary of the UAT satisfaction and SUS results].</w:t>
       </w:r>
     </w:p>
     <w:p>
@@ -15690,7 +15677,7 @@
         <w:rPr>
           <w:cs/>
         </w:rPr>
-        <w:t>ปัจจุบันภายในมหาวิทยาลัยเกษตรศาสตร์ วิทยาเขตกำแพงแสน มีพื้นที่กว้างและมีระยะทางระหว่างอาคารเรียน หอพัก โรงอาหาร และสถานที่สำคัญต่าง ๆ ค่อนข้างไกล ทำให้นิสิต บุคลากร และผู้มาติดต่อราชการจำนวนมากเลือกใช้บริการรถจักรยานยนต์รับจ้าง (วินมอเตอร์ไซค์) เพื่อความสะดวกและรวดเร็วในการเดินทาง</w:t>
+        <w:t>ปัจจุบันภายในมหาวิทยาลัยเกษตรศาสตร์ วิทยาเขตกำแพงแสน มีวิทยาเขตกว้างและมีระยะทางระหว่างอาคารเรียน หอพัก โรงอาหาร และสถานที่สำคัญต่าง ๆ ค่อนข้างไกล ทำให้นิสิต บุคลากร และผู้มาติดต่อราชการจำนวนมากเลือกใช้บริการรถจักรยานยนต์รับจ้าง (วินมอเตอร์ไซค์) เพื่อความสะดวกและรวดเร็วในการเดินทาง</w:t>
       </w:r>
     </w:p>
     <w:p>
@@ -15714,7 +15701,7 @@
         <w:rPr>
           <w:cs/>
         </w:rPr>
-        <w:t>จากปัญหาดังกล่าว ผู้จัดทำจึงพัฒนาระบบเรียกวินมอเตอร์ไซค์ผ่าน KU VIN เพื่อเป็นระบบกลางในการเชื่อมต่อระหว่างผู้ใช้บริการและผู้ขับขี่วินมอเตอร์ไซค์ โดยผู้ใช้สามารถระบุจุดรับและจุดหมายปลายทาง ดูค่าโดยสารก่อนยืนยัน และส่งคำขอเรียกรถผ่านแอปพลิเคชันได้อย่างสะดวก ระบบจะเสนองานให้ผู้ขับขี่ตามลำดับคิวอย่างเป็นธรรม และแสดงสถานะการเดินทางพร้อมตำแหน่งของผู้ขับขี่แบบเรียลไทม์</w:t>
+        <w:t>จากปัญหาดังกล่าว ผู้จัดทำจึงพัฒนาระบบเรียกวินมอเตอร์ไซค์ผ่าน KUVIN เพื่อเป็นระบบกลางในการเชื่อมต่อระหว่างผู้ใช้บริการและผู้ขับขี่วินมอเตอร์ไซค์ โดยผู้ใช้สามารถระบุจุดรับและจุดหมายปลายทาง ดูค่าโดยสารก่อนยืนยัน และส่งคำขอเรียกรถผ่านแอปพลิเคชันได้อย่างสะดวก ระบบจะเสนองานให้ผู้ขับขี่ตามลำดับคิวอย่างเป็นธรรม และแสดงสถานะการเดินทางพร้อมตำแหน่งของผู้ขับขี่แบบเรียลไทม์</w:t>
       </w:r>
     </w:p>
     <w:p>
@@ -15899,7 +15886,7 @@
         <w:rPr>
           <w:cs/>
         </w:rPr>
-        <w:t>ขอบเขตการดำเนินงานแบ่งออกเป็น 4 ด้าน ได้แก่ ด้านระบบ ด้านผู้ใช้งาน ด้านพื้นที่ และด้านเวลา ดังนี้</w:t>
+        <w:t>ขอบเขตการดำเนินงานแบ่งออกเป็น 4 ด้าน ได้แก่ ด้านระบบ ด้านผู้ใช้งาน ด้านวิทยาเขต และด้านเวลา ดังนี้</w:t>
       </w:r>
     </w:p>
     <w:p>
@@ -16157,7 +16144,7 @@
         <w:rPr>
           <w:cs/>
         </w:rPr>
-        <w:t>1.3.3 ขอบเขตด้านพื้นที่</w:t>
+        <w:t>1.3.3 ขอบเขตด้านวิทยาเขต</w:t>
       </w:r>
       <w:bookmarkEnd w:id="12"/>
     </w:p>
@@ -16170,7 +16157,7 @@
         <w:rPr>
           <w:cs/>
         </w:rPr>
-        <w:t>ศึกษา ออกแบบ พัฒนา และทดลองใช้งานระบบภายในมหาวิทยาลัยเกษตรศาสตร์ วิทยาเขตกำแพงแสน โดยระบบถูกออกแบบให้รองรับหลายพื้นที่ให้บริการ (Multi-area) เพื่อให้นำไปขยายใช้กับพื้นที่อื่นได้ในอนาคต แต่การทดลองใช้งานในปัญหาพิเศษนี้ครอบคลุมเฉพาะพื้นที่ให้บริการภายในวิทยาเขตกำแพงแสน</w:t>
+        <w:t>ศึกษา ออกแบบ พัฒนา และทดลองใช้งานระบบภายในมหาวิทยาลัยเกษตรศาสตร์ วิทยาเขตกำแพงแสน โดยระบบถูกออกแบบให้รองรับหลายวิทยาเขต (Multi-area) เพื่อให้นำไปขยายใช้กับวิทยาเขตอื่นได้ในอนาคต แต่การทดลองใช้งานในปัญหาพิเศษนี้ครอบคลุมเฉพาะวิทยาเขตภายในวิทยาเขตกำแพงแสน</w:t>
       </w:r>
     </w:p>
     <w:p>
@@ -16504,7 +16491,7 @@
         <w:rPr>
           <w:cs/>
         </w:rPr>
-        <w:t>เครื่องมือจัดการ Container และการติดตั้งระบบ: Docker และ Railway</w:t>
+        <w:t>เครื่องมือจัดการ Container และการติดตั้งระบบ: Docker, Nginx และ VPS ของ Hostinger</w:t>
       </w:r>
     </w:p>
     <w:p>
@@ -16745,7 +16732,7 @@
         <w:rPr>
           <w:cs/>
         </w:rPr>
-        <w:t>ออกแบบสถาปัตยกรรมระบบ แผนภาพ UML และฐานข้อมูล แล้วพัฒนา REST API แอปพลิเคชันสำหรับผู้ใช้บริการและผู้ขับขี่ และ Web Dashboard สำหรับผู้ดูแลระบบ โดยพัฒนาเพิ่มทีละฟังก์ชันและนำขึ้นใช้งานจริงบน Railway อย่างต่อเนื่อง</w:t>
+        <w:t>ออกแบบสถาปัตยกรรมระบบ แผนภาพ UML และฐานข้อมูล แล้วพัฒนา REST API แอปพลิเคชันสำหรับผู้ใช้บริการและผู้ขับขี่ และ Web Dashboard สำหรับผู้ดูแลระบบ โดยพัฒนาเพิ่มทีละฟังก์ชันและนำขึ้นใช้งานจริงบน VPS ของ Hostinger อย่างต่อเนื่อง</w:t>
       </w:r>
     </w:p>
     <w:p>
@@ -19454,7 +19441,7 @@
         <w:rPr>
           <w:cs/>
         </w:rPr>
-        <w:t>ได้ต้นแบบระบบเรียกวินรถจักรยานยนต์ที่รองรับหลายพื้นที่ สามารถนำไปประยุกต์ใช้กับหน่วยงานหรือสถาบันการศึกษาอื่นที่มีลักษณะการให้บริการคล้ายคลึงกัน</w:t>
+        <w:t>ได้ต้นแบบระบบเรียกวินรถจักรยานยนต์ที่รองรับหลายวิทยาเขต สามารถนำไปประยุกต์ใช้กับหน่วยงานหรือสถาบันการศึกษาอื่นที่มีลักษณะการให้บริการคล้ายคลึงกัน</w:t>
       </w:r>
     </w:p>
     <w:p>
@@ -20045,7 +20032,7 @@
               <w:rPr>
                 <w:cs/>
               </w:rPr>
-              <w:t>พื้นที่ให้บริการ (Area)</w:t>
+              <w:t>วิทยาเขต (Area)</w:t>
             </w:r>
           </w:p>
         </w:tc>
@@ -20158,7 +20145,7 @@
           <w:highlight w:val="yellow"/>
           <w:cs/>
         </w:rPr>
-        <w:t>[ระบุแหล่งเงินทุน หรือค่าใช้จ่ายที่เกิดขึ้น เช่น ค่าบริการ Railway และ EasySlip หากไม่มีให้ระบุว่าไม่ได้รับทุนสนับสนุน]</w:t>
+        <w:t>[ระบุแหล่งเงินทุน หรือค่าใช้จ่ายที่เกิดขึ้น เช่น ค่าบริการ Hostinger VPS และ EasySlip หากไม่มีให้ระบุว่าไม่ได้รับทุนสนับสนุน]</w:t>
       </w:r>
     </w:p>
     <w:p>
@@ -20192,7 +20179,7 @@
         <w:rPr>
           <w:cs/>
         </w:rPr>
-        <w:t>ในการพัฒนาระบบเรียกวินมอเตอร์ไซค์ผ่าน KU VIN ผู้จัดทำได้ศึกษาแนวคิด ทฤษฎี เครื่องมือ และงานวิจัยที่เกี่ยวข้อง เพื่อนำมาใช้เป็นแนวทางในการออกแบบและพัฒนาระบบ ดังนี้</w:t>
+        <w:t>ในการพัฒนาระบบเรียกวินมอเตอร์ไซค์ผ่าน KUVIN ผู้จัดทำได้ศึกษาแนวคิด ทฤษฎี เครื่องมือ และงานวิจัยที่เกี่ยวข้อง เพื่อนำมาใช้เป็นแนวทางในการออกแบบและพัฒนาระบบ ดังนี้</w:t>
       </w:r>
     </w:p>
     <w:p>
@@ -20328,7 +20315,7 @@
         <w:rPr>
           <w:cs/>
         </w:rPr>
-        <w:t xml:space="preserve"> แยกสิทธิ์ของผู้ใช้บริการ ผู้ขับขี่ ผู้ดูแลพื้นที่ และผู้ดูแลระบบสูงสุด</w:t>
+        <w:t xml:space="preserve"> แยกสิทธิ์ของผู้ใช้บริการ ผู้ขับขี่ ผู้ดูแลวิทยาเขต และผู้ดูแลระบบสูงสุด</w:t>
       </w:r>
     </w:p>
     <w:p>
@@ -20667,7 +20654,7 @@
         <w:rPr>
           <w:cs/>
         </w:rPr>
-        <w:t>PostgreSQL เป็นระบบจัดการฐานข้อมูลเชิงสัมพันธ์แบบโอเพนซอร์ส รองรับมาตรฐาน SQL การทำธุรกรรมตามหลัก ACID และการล็อกระดับแถว (Row-Level Locking) ระบบนี้ใช้ PostgreSQL จัดเก็บข้อมูลพื้นที่ให้บริการ ผู้ใช้งาน ผู้ขับขี่ คำขอใช้บริการ การชำระเงิน คะแนน และการแจ้งเหตุฉุกเฉิน</w:t>
+        <w:t>PostgreSQL เป็นระบบจัดการฐานข้อมูลเชิงสัมพันธ์แบบโอเพนซอร์ส รองรับมาตรฐาน SQL การทำธุรกรรมตามหลัก ACID และการล็อกระดับแถว (Row-Level Locking) ระบบนี้ใช้ PostgreSQL จัดเก็บข้อมูลวิทยาเขต ผู้ใช้งาน ผู้ขับขี่ คำขอใช้บริการ การชำระเงิน คะแนน และการแจ้งเหตุฉุกเฉิน</w:t>
       </w:r>
     </w:p>
     <w:p>
@@ -21980,7 +21967,7 @@
         <w:rPr>
           <w:cs/>
         </w:rPr>
-        <w:t>Requirement ของระบบเรียกวินมอเตอร์ไซค์ผ่าน KU VIN</w:t>
+        <w:t>Requirement ของระบบเรียกวินมอเตอร์ไซค์ผ่าน KUVIN</w:t>
       </w:r>
       <w:bookmarkEnd w:id="57"/>
     </w:p>
@@ -22062,7 +22049,7 @@
               <w:rPr>
                 <w:cs/>
               </w:rPr>
-              <w:t>ระบบเรียกวินมอเตอร์ไซค์ภายในมหาวิทยาลัยเกษตรศาสตร์ วิทยาเขตกำแพงแสน ผ่าน KU VIN</w:t>
+              <w:t>ระบบเรียกวินมอเตอร์ไซค์ภายในมหาวิทยาลัยเกษตรศาสตร์ วิทยาเขตกำแพงแสน ผ่าน KUVIN</w:t>
             </w:r>
           </w:p>
         </w:tc>
@@ -22424,7 +22411,7 @@
         <w:rPr>
           <w:cs/>
         </w:rPr>
-        <w:t>ระบบต้องคำนวณค่าโดยสารอัตโนมัติตามอัตราของพื้นที่ให้บริการ โดยพื้นที่วิทยาเขตกำแพงแสนคิดเหมาจ่าย 20 บาทเมื่อจุดรับและจุดส่งอยู่ในรัศมี 2 กิโลเมตรจากจุดกลาง และคิด 10 บาทต่อกิโลเมตรตามระยะทางถนนจริงเมื่อเดินทางออกนอกเขต โดยค่าโดยสารขั้นต่ำ 20 บาท</w:t>
+        <w:t>ระบบต้องคำนวณค่าโดยสารอัตโนมัติตามอัตราของวิทยาเขต โดยวิทยาเขตวิทยาเขตกำแพงแสนคิดเหมาจ่าย 20 บาทเมื่อจุดรับและจุดส่งอยู่ในรัศมี 2 กิโลเมตรจากจุดกลาง และคิด 10 บาทต่อกิโลเมตรตามระยะทางถนนจริงเมื่อเดินทางออกนอกเขต โดยค่าโดยสารขั้นต่ำ 20 บาท</w:t>
       </w:r>
     </w:p>
     <w:p>
@@ -22529,7 +22516,7 @@
         <w:rPr>
           <w:cs/>
         </w:rPr>
-        <w:t>ผู้ใช้บริการและผู้ขับขี่สามารถแจ้งเหตุฉุกเฉิน (SOS) พร้อมพิกัด และระบบต้องแจ้งผู้ดูแลระบบของพื้นที่นั้นทันที</w:t>
+        <w:t>ผู้ใช้บริการและผู้ขับขี่สามารถแจ้งเหตุฉุกเฉิน (SOS) พร้อมพิกัด และระบบต้องแจ้งผู้ดูแลระบบของวิทยาเขตนั้นทันที</w:t>
       </w:r>
     </w:p>
     <w:p>
@@ -22571,7 +22558,7 @@
         <w:rPr>
           <w:cs/>
         </w:rPr>
-        <w:t>ผู้ดูแลระบบสามารถดูสถิติ อนุมัติหรือปฏิเสธผู้ขับขี่ จัดการและระงับบัญชีผู้ใช้งาน ดูรายการเดินทางและแก้ไขข้อพิพาทการชำระเงิน จัดการสถานที่ และตั้งค่าพื้นที่ให้บริการผ่าน Web Dashboard ได้</w:t>
+        <w:t>ผู้ดูแลระบบสามารถดูสถิติ อนุมัติหรือปฏิเสธผู้ขับขี่ จัดการและระงับบัญชีผู้ใช้งาน ดูรายการเดินทางและแก้ไขข้อพิพาทการชำระเงิน จัดการสถานที่ และตั้งค่าวิทยาเขตผ่าน Web Dashboard ได้</w:t>
       </w:r>
     </w:p>
     <w:p>
@@ -22599,7 +22586,35 @@
       <w:r>
         <w:t>FR-13</w:t>
         <w:tab/>
-        <w:t>ผู้ใช้แจ้งปัญหาหลังทริป เช่น ขับรถอันตราย และผู้ดูแลระบบของพื้นที่ตรวจสอบและปิดเคสพร้อมบันทึกการจัดการได้</w:t>
+        <w:t>ผู้ใช้แจ้งปัญหาหลังทริป เช่น ขับรถอันตราย และผู้ดูแลระบบของวิทยาเขตตรวจสอบและปิดเคสพร้อมบันทึกการจัดการได้</w:t>
+      </w:r>
+    </w:p>
+    <w:p>
+      <w:pPr>
+        <w:tabs>
+          <w:tab w:val="left" w:pos="1440"/>
+        </w:tabs>
+        <w:ind w:left="1440" w:hanging="720"/>
+        <w:jc w:val="thaiDistribute"/>
+      </w:pPr>
+      <w:r>
+        <w:t>FR-14</w:t>
+        <w:tab/>
+        <w:t>ผู้ใช้ตั้ง เปลี่ยน และลบรูปโปรไฟล์ได้ (ถ่ายหรือเลือกจากคลังรูป ระบบย่อรูปก่อนอัปโหลด) และอีกฝ่ายในทริปเห็นรูปนี้เพื่อจับคู่ตัวบุคคลที่จุดรับ</w:t>
+      </w:r>
+    </w:p>
+    <w:p>
+      <w:pPr>
+        <w:tabs>
+          <w:tab w:val="left" w:pos="1440"/>
+        </w:tabs>
+        <w:ind w:left="1440" w:hanging="720"/>
+        <w:jc w:val="thaiDistribute"/>
+      </w:pPr>
+      <w:r>
+        <w:t>FR-15</w:t>
+        <w:tab/>
+        <w:t>ระบบส่งการแจ้งเตือนแบบเด้งบนมือถือ (Android) เมื่อมีงานเข้า คนขับรับงาน ถึงจุดรับ จบทริป และมีข้อความแชตใหม่ แม้ปิดหน้าจอหรือไม่ได้เปิดแอป</w:t>
       </w:r>
     </w:p>
     <w:p>
@@ -22733,7 +22748,7 @@
         <w:rPr>
           <w:cs/>
         </w:rPr>
-        <w:t>ระบบควรออกแบบให้ขยายเพิ่มพื้นที่ให้บริการและฟังก์ชันใหม่ในอนาคตได้</w:t>
+        <w:t>ระบบควรออกแบบให้ขยายเพิ่มวิทยาเขตและฟังก์ชันใหม่ในอนาคตได้</w:t>
       </w:r>
     </w:p>
     <w:p>
@@ -23080,7 +23095,7 @@
               <w:rPr>
                 <w:cs/>
               </w:rPr>
-              <w:t>ยืนยันตัวตน ออนไลน์เข้าคิว รับหรือปฏิเสธงาน อัปเดตสถานะ ยืนยันการรับเงิน ให้คะแนนผู้โดยสาร ดูรายรับรายจ่าย สังกัดพื้นที่เดียว</w:t>
+              <w:t>ยืนยันตัวตน ออนไลน์เข้าคิว รับหรือปฏิเสธงาน อัปเดตสถานะ ยืนยันการรับเงิน ให้คะแนนผู้โดยสาร ดูรายรับรายจ่าย สังกัดวิทยาเขตเดียว</w:t>
             </w:r>
           </w:p>
         </w:tc>
@@ -23116,7 +23131,7 @@
               <w:rPr>
                 <w:cs/>
               </w:rPr>
-              <w:t>ผู้ดูแลพื้นที่ (Area Admin)</w:t>
+              <w:t>ผู้ดูแลวิทยาเขต (Area Admin)</w:t>
             </w:r>
           </w:p>
         </w:tc>
@@ -23163,7 +23178,7 @@
               <w:rPr>
                 <w:cs/>
               </w:rPr>
-              <w:t>จัดการข้อมูลผู้ขับขี่ ผู้ใช้ ทริป สถานที่ SOS และตั้งค่าโดยสารเฉพาะพื้นที่ของตนเอง</w:t>
+              <w:t>จัดการข้อมูลผู้ขับขี่ ผู้ใช้ ทริป สถานที่ SOS และตั้งค่าโดยสารเฉพาะวิทยาเขตของตนเอง</w:t>
             </w:r>
           </w:p>
         </w:tc>
@@ -23246,7 +23261,7 @@
               <w:rPr>
                 <w:cs/>
               </w:rPr>
-              <w:t>ทำได้ทุกอย่างของผู้ดูแลพื้นที่ในทุกพื้นที่ สร้างพื้นที่ใหม่ และสร้างบัญชีผู้ดูแลพื้นที่</w:t>
+              <w:t>ทำได้ทุกอย่างของผู้ดูแลวิทยาเขตในทุกวิทยาเขต สร้างวิทยาเขตใหม่ และสร้างบัญชีผู้ดูแลวิทยาเขต</w:t>
             </w:r>
           </w:p>
         </w:tc>
@@ -23360,7 +23375,7 @@
         <w:rPr>
           <w:cs/>
         </w:rPr>
-        <w:t>สถาปัตยกรรมของระบบเรียกวินมอเตอร์ไซค์ผ่าน KU VIN</w:t>
+        <w:t>สถาปัตยกรรมของระบบเรียกวินมอเตอร์ไซค์ผ่าน KUVIN</w:t>
       </w:r>
       <w:bookmarkEnd w:id="65"/>
     </w:p>
@@ -23406,7 +23421,7 @@
         <w:rPr>
           <w:cs/>
         </w:rPr>
-        <w:t>ภาพที่ 3.2 แสดงขั้นตอนการเรียกวินตั้งแต่ผู้ใช้บริการเลือกจุดหมายจนจบการเดินทาง ระบบเลือกพื้นที่ให้บริการจากพิกัดจุดรับ หากจุดรับอยู่นอกรัศมีให้บริการของทุกพื้นที่จะไม่สามารถเรียกวินได้</w:t>
+        <w:t>ภาพที่ 3.2 แสดงขั้นตอนการเรียกวินตั้งแต่ผู้ใช้บริการเลือกจุดหมายจนจบการเดินทาง ระบบเลือกวิทยาเขตจากพิกัดจุดรับ หากจุดรับอยู่นอกรัศมีให้บริการของทุกวิทยาเขตจะไม่สามารถเรียกวินได้</w:t>
       </w:r>
     </w:p>
     <w:p>
@@ -23505,7 +23520,7 @@
         <w:rPr>
           <w:cs/>
         </w:rPr>
-        <w:t>ระบบจัดคิวผู้ขับขี่ของแต่ละพื้นที่แยกกัน เรียงตามเวลาที่ผู้ขับขี่กดออนไลน์ (First In, First Out) และเสนองานให้ทีละคน คนละ 15 วินาที ดังภาพที่ 3.3 หากผู้ขับขี่ปฏิเสธงานจะถูกย้ายไปท้ายคิว หากไม่ตอบสนองภายในเวลาจะถูกย้ายไปต่อจากผู้ขับขี่ที่ได้งานในรอบนั้น และหากไม่ตอบสนองติดต่อกันครบ 3 ครั้ง ระบบจะสันนิษฐานว่าแอปพลิเคชันค้างหรือการเชื่อมต่อหลุด และปรับสถานะผู้ขับขี่เป็นออฟไลน์ เพื่อไม่ให้ผู้ใช้บริการต้องรอนาน</w:t>
+        <w:t>ระบบจัดคิวผู้ขับขี่ของแต่ละวิทยาเขตแยกกัน เรียงตามเวลาที่ผู้ขับขี่กดออนไลน์ (First In, First Out) และเสนองานให้ทีละคน คนละ 15 วินาที ดังภาพที่ 3.3 หากผู้ขับขี่ปฏิเสธงานจะถูกย้ายไปท้ายคิว หากไม่ตอบสนองภายในเวลาจะถูกย้ายไปต่อจากผู้ขับขี่ที่ได้งานในรอบนั้น และหากไม่ตอบสนองติดต่อกันครบ 3 ครั้ง ระบบจะสันนิษฐานว่าแอปพลิเคชันค้างหรือการเชื่อมต่อหลุด และปรับสถานะผู้ขับขี่เป็นออฟไลน์ เพื่อไม่ให้ผู้ใช้บริการต้องรอนาน</w:t>
       </w:r>
     </w:p>
     <w:p>
@@ -23614,7 +23629,7 @@
         <w:rPr>
           <w:cs/>
         </w:rPr>
-        <w:t>ค่าโดยสารคำนวณตามอัตราที่ผู้ดูแลกำหนดให้แต่ละพื้นที่ โดยใช้เงื่อนไขดังนี้</w:t>
+        <w:t>ค่าโดยสารคำนวณตามอัตราที่ผู้ดูแลกำหนดให้แต่ละวิทยาเขต โดยใช้เงื่อนไขดังนี้</w:t>
       </w:r>
     </w:p>
     <w:p>
@@ -23630,7 +23645,7 @@
         <w:rPr>
           <w:cs/>
         </w:rPr>
-        <w:t>หากจุดรับและจุดส่งอยู่ในรัศมีเขตเหมาจ่ายจากจุดกลางของพื้นที่ทั้งคู่ คิดค่าโดยสารเหมาจ่าย</w:t>
+        <w:t>หากจุดรับและจุดส่งอยู่ในรัศมีเขตเหมาจ่ายจากจุดกลางของวิทยาเขตทั้งคู่ คิดค่าโดยสารเหมาจ่าย</w:t>
       </w:r>
     </w:p>
     <w:p>
@@ -23667,7 +23682,7 @@
         <w:rPr>
           <w:cs/>
         </w:rPr>
-        <w:t>อัตราค่าโดยสารของพื้นที่มหาวิทยาลัยเกษตรศาสตร์ วิทยาเขตกำแพงแสน</w:t>
+        <w:t>อัตราค่าโดยสารของวิทยาเขตมหาวิทยาลัยเกษตรศาสตร์ วิทยาเขตกำแพงแสน</w:t>
       </w:r>
       <w:bookmarkEnd w:id="71"/>
     </w:p>
@@ -24054,7 +24069,7 @@
               <w:rPr>
                 <w:cs/>
               </w:rPr>
-              <w:t>รัศมีพื้นที่ให้บริการ (serviceRadiusKm)</w:t>
+              <w:t>รัศมีวิทยาเขต (serviceRadiusKm)</w:t>
             </w:r>
           </w:p>
         </w:tc>
@@ -24179,7 +24194,7 @@
         <w:rPr>
           <w:cs/>
         </w:rPr>
-        <w:t>Class Diagram ของระบบเรียกวินมอเตอร์ไซค์ผ่าน KU VIN</w:t>
+        <w:t>Class Diagram ของระบบเรียกวินมอเตอร์ไซค์ผ่าน KUVIN</w:t>
       </w:r>
       <w:bookmarkEnd w:id="73"/>
     </w:p>
@@ -24716,7 +24731,7 @@
               <w:rPr>
                 <w:cs/>
               </w:rPr>
-              <w:t>พื้นที่ให้บริการ เก็บจุดกลาง รัศมี อัตราค่าโดยสาร เบอร์ฉุกเฉิน ชื่อ และโลโก้ของแต่ละพื้นที่</w:t>
+              <w:t>วิทยาเขต เก็บจุดกลาง รัศมี อัตราค่าโดยสาร เบอร์ฉุกเฉิน ชื่อ และโลโก้ของแต่ละวิทยาเขต</w:t>
             </w:r>
           </w:p>
         </w:tc>
@@ -24949,7 +24964,7 @@
               <w:rPr>
                 <w:cs/>
               </w:rPr>
-              <w:t>ผู้ดูแลระบบ เก็บบทบาท (ผู้ดูแลระบบสูงสุด หรือผู้ดูแลพื้นที่) และพื้นที่ที่ดูแล</w:t>
+              <w:t>ผู้ดูแลระบบ เก็บบทบาท (ผู้ดูแลระบบสูงสุด หรือผู้ดูแลวิทยาเขต) และวิทยาเขตที่ดูแล</w:t>
             </w:r>
           </w:p>
         </w:tc>
@@ -25181,7 +25196,7 @@
               <w:rPr>
                 <w:cs/>
               </w:rPr>
-              <w:t>สถานที่ภายในพื้นที่ให้บริการสำหรับค้นหาจุดหมาย และสถานที่ยอดนิยม</w:t>
+              <w:t>สถานที่ภายในวิทยาเขตสำหรับค้นหาจุดหมาย และสถานที่ยอดนิยม</w:t>
             </w:r>
           </w:p>
         </w:tc>
@@ -27530,7 +27545,7 @@
               <w:rPr>
                 <w:cs/>
               </w:rPr>
-              <w:t>ข้อมูลพื้นที่ให้บริการที่เปิดอยู่ และหาพื้นที่จากพิกัด</w:t>
+              <w:t>ข้อมูลวิทยาเขตที่เปิดอยู่ และหาวิทยาเขตจากพิกัด</w:t>
             </w:r>
           </w:p>
         </w:tc>
@@ -27994,7 +28009,7 @@
               <w:rPr>
                 <w:cs/>
               </w:rPr>
-              <w:t>สถิติ จัดการผู้ใช้และผู้ขับขี่ อนุมัติผู้ขับขี่ ระงับบัญชี ทริปและข้อพิพาท สถานที่ SOS พื้นที่ และบัญชีผู้ดูแล</w:t>
+              <w:t>สถิติ จัดการผู้ใช้และผู้ขับขี่ อนุมัติผู้ขับขี่ ระงับบัญชี ทริปและข้อพิพาท สถานที่ SOS วิทยาเขต และบัญชีผู้ดูแล</w:t>
             </w:r>
           </w:p>
         </w:tc>
@@ -28729,7 +28744,7 @@
               <w:rPr>
                 <w:cs/>
               </w:rPr>
-              <w:t>มีการแจ้งเหตุฉุกเฉินในพื้นที่</w:t>
+              <w:t>มีการแจ้งเหตุฉุกเฉินในวิทยาเขต</w:t>
             </w:r>
           </w:p>
         </w:tc>
@@ -28964,7 +28979,7 @@
         <w:rPr>
           <w:cs/>
         </w:rPr>
-        <w:t>ผู้จัดทำเขียนชุดทดสอบของ API ด้วย Node.js และโมดูล node:assert จำนวน 9 ชุด ทำงานกับฐานข้อมูล PostgreSQL จริง ชุดที่เกี่ยวกับคิว การยืนยันตัวตน การรองรับหลายพื้นที่ แชต ความปลอดภัย และความปลอดภัยระหว่างทริป เรียก Service ของระบบโดยตรง ส่วนชุดทดสอบการระงับบัญชีและการชำระเงินส่งคำขอ HTTP และเชื่อมต่อ Socket.IO ไปยัง API Server ที่เปิดอยู่จริง ชุดทดสอบสร้างข้อมูลทดสอบขึ้นเองและลบทิ้งเมื่อจบ ครอบคลุมส่วนที่ซับซ้อนและมีผลกระทบสูง รวมถึงกรณีเรียกใช้พร้อมกัน (Concurrency) เช่น ผู้ขับขี่กดรับและปฏิเสธงานในเวลาเดียวกัน และคำขอหลายรายการเข้ามาพร้อมกัน นอกจากนี้ผู้จัดทำใช้ c8 วัดความครอบคลุมของโค้ด (Code Coverage) และใช้ SonarQube ตรวจคุณภาพโค้ดด้านข้อผิดพลาด ช่องโหว่ และความซับซ้อน</w:t>
+        <w:t>ผู้จัดทำเขียนชุดทดสอบของ API ด้วย Node.js และโมดูล node:assert จำนวน 10 ชุด ทำงานกับฐานข้อมูล PostgreSQL จริง ชุดที่เกี่ยวกับคิว การยืนยันตัวตน การรองรับหลายวิทยาเขต แชต ความปลอดภัย ความปลอดภัยระหว่างทริป และรูปโปรไฟล์ เรียก Service ของระบบโดยตรง ส่วนชุดทดสอบการระงับบัญชีและการชำระเงินส่งคำขอ HTTP และเชื่อมต่อ Socket.IO ไปยัง API Server ที่เปิดอยู่จริง ชุดทดสอบสร้างข้อมูลทดสอบขึ้นเองและลบทิ้งเมื่อจบ ครอบคลุมส่วนที่ซับซ้อนและมีผลกระทบสูง รวมถึงกรณีเรียกใช้พร้อมกัน (Concurrency) เช่น ผู้ขับขี่กดรับและปฏิเสธงานในเวลาเดียวกัน และคำขอหลายรายการเข้ามาพร้อมกัน นอกจากนี้ผู้จัดทำใช้ c8 วัดความครอบคลุมของโค้ด (Code Coverage) และใช้ SonarQube ตรวจคุณภาพโค้ดด้านข้อผิดพลาด ช่องโหว่ และความซับซ้อน</w:t>
       </w:r>
     </w:p>
     <w:p>
@@ -28990,7 +29005,7 @@
         <w:rPr>
           <w:cs/>
         </w:rPr>
-        <w:t>ผู้จัดทำเขียนชุดทดสอบด้วย Playwright ควบคุมเบราว์เซอร์ Chromium ขนาดหน้าจอมือถือ (375×812) ทำตามขั้นตอนของผู้ใช้จริงบน Docker Compose ที่ประกอบด้วยฐานข้อมูล API แอปพลิเคชัน และ Web Dashboard รวม 27 กรณี ใน 5 ชุด ได้แก่ ระบบขึ้นครบ การสมัครและเข้าสู่ระบบของผู้โดยสาร ทริปเต็มด้วยผู้ใช้ 2 คนพร้อมกัน (ผู้โดยสารและผู้ขับขี่) ความปลอดภัยและความเป็นส่วนตัว และการสมัครผู้ขับขี่พร้อมการตรวจเอกสารของผู้ดูแล ทุกขั้นตอนถ่ายรูปหน้าจอเก็บเป็นหลักฐาน ชุดทดสอบนี้รันใน GitHub Actions ทุกครั้งที่ส่งโค้ด และมีเช็กลิสต์ทดสอบด้วยมือบนอุปกรณ์จริง 16 ข้อ (M-01 ถึง M-16) สำหรับสิ่งที่เครื่องอัตโนมัติจำลองไม่ได้ เช่น กล้องจริง GPS จริง และ iPhone Safari</w:t>
+        <w:t>ผู้จัดทำเขียนชุดทดสอบด้วย Playwright ควบคุมเบราว์เซอร์ Chromium ขนาดหน้าจอมือถือ (375×812) ทำตามขั้นตอนของผู้ใช้จริงบน Docker Compose ที่ประกอบด้วยฐานข้อมูล API แอปพลิเคชัน และ Web Dashboard รวม 28 กรณี ใน 5 ชุด ได้แก่ ระบบขึ้นครบ การสมัครและเข้าสู่ระบบของผู้โดยสาร ทริปเต็มด้วยผู้ใช้ 2 คนพร้อมกัน (ผู้โดยสารและผู้ขับขี่) ความปลอดภัยและความเป็นส่วนตัว และการสมัครผู้ขับขี่พร้อมการตรวจเอกสารของผู้ดูแล ทุกขั้นตอนถ่ายรูปหน้าจอเก็บเป็นหลักฐาน ชุดทดสอบนี้รันใน GitHub Actions ทุกครั้งที่ส่งโค้ด และมีเช็กลิสต์ทดสอบด้วยมือบนอุปกรณ์จริง 16 ข้อ (M-01 ถึง M-16) สำหรับสิ่งที่เครื่องอัตโนมัติจำลองไม่ได้ เช่น กล้องจริง GPS จริง และ iPhone Safari</w:t>
       </w:r>
     </w:p>
     <w:p>
@@ -29999,7 +30014,7 @@
         <w:rPr>
           <w:cs/>
         </w:rPr>
-        <w:t>หน้าโลโก้ KU VIN ระหว่างระบบเตรียมข้อมูล</w:t>
+        <w:t>หน้าโลโก้ KUVIN ระหว่างระบบเตรียมข้อมูล</w:t>
       </w:r>
     </w:p>
     <w:p>
@@ -30015,7 +30030,7 @@
         <w:rPr>
           <w:cs/>
         </w:rPr>
-        <w:t>หน้าแนะนำการใช้งาน เช่น เรียกวินได้ทุกที่ในพื้นที่ให้บริการ เลือกจุดรับและจุดส่งบนแผนที่ได้ และบัญชีเดียวใช้ได้ทุกพื้นที่</w:t>
+        <w:t>หน้าแนะนำการใช้งาน เช่น เรียกวินได้ทุกที่ในวิทยาเขต เลือกจุดรับและจุดส่งบนแผนที่ได้ และบัญชีเดียวใช้ได้ทุกวิทยาเขต</w:t>
       </w:r>
     </w:p>
     <w:p>
@@ -30532,7 +30547,7 @@
         <w:rPr>
           <w:cs/>
         </w:rPr>
-        <w:t>ค้นหาจากชื่อสถานที่ภายในพื้นที่ให้บริการ เช่น อาคารเรียน หอพัก และโรงอาหาร</w:t>
+        <w:t>ค้นหาจากชื่อสถานที่ภายในวิทยาเขต เช่น อาคารเรียน หอพัก และโรงอาหาร</w:t>
       </w:r>
     </w:p>
     <w:p>
@@ -30743,7 +30758,7 @@
         <w:rPr>
           <w:cs/>
         </w:rPr>
-        <w:t>ค่าบริการที่คำนวณตามอัตราของพื้นที่ พร้อมระบุว่าเป็นค่าเหมาจ่ายหรือคิดตามระยะทาง</w:t>
+        <w:t>ค่าบริการที่คำนวณตามอัตราของวิทยาเขต พร้อมระบุว่าเป็นค่าเหมาจ่ายหรือคิดตามระยะทาง</w:t>
       </w:r>
     </w:p>
     <w:p>
@@ -31656,7 +31671,7 @@
         <w:rPr>
           <w:cs/>
         </w:rPr>
-        <w:t>ปุ่ม "แจ้งปัญหา" ในแต่ละทริปที่จบแล้ว ให้เลือกหมวดปัญหา (เช่น ขับรถอันตราย) พร้อมรายละเอียด ส่งถึงผู้ดูแลของพื้นที่ แจ้งซ้ำในทริปเดิมไม่ได้ขณะเคสยังเปิดอยู่</w:t>
+        <w:t>ปุ่ม "แจ้งปัญหา" ในแต่ละทริปที่จบแล้ว ให้เลือกหมวดปัญหา (เช่น ขับรถอันตราย) พร้อมรายละเอียด ส่งถึงผู้ดูแลของวิทยาเขต แจ้งซ้ำในทริปเดิมไม่ได้ขณะเคสยังเปิดอยู่</w:t>
       </w:r>
     </w:p>
     <w:p>
@@ -31699,8 +31714,8 @@
       <w:r>
         <w:drawing>
           <wp:inline xmlns:a="http://schemas.openxmlformats.org/drawingml/2006/main" xmlns:pic="http://schemas.openxmlformats.org/drawingml/2006/picture">
-            <wp:extent cx="1728000" cy="3741696"/>
-            <wp:docPr id="2117811028" name="Picture 2117811028"/>
+            <wp:extent cx="1655999" cy="3585790"/>
+            <wp:docPr id="2117811085" name="Picture 2117811085"/>
             <wp:cNvGraphicFramePr>
               <a:graphicFrameLocks noChangeAspect="1"/>
             </wp:cNvGraphicFramePr>
@@ -31708,11 +31723,11 @@
               <a:graphicData uri="http://schemas.openxmlformats.org/drawingml/2006/picture">
                 <pic:pic>
                   <pic:nvPicPr>
-                    <pic:cNvPr id="0" name="p-profile.png"/>
+                    <pic:cNvPr id="0" name="12-avatar-profile.png"/>
                     <pic:cNvPicPr/>
                   </pic:nvPicPr>
                   <pic:blipFill>
-                    <a:blip r:embed="rId45"/>
+                    <a:blip r:embed="rId81"/>
                     <a:stretch>
                       <a:fillRect/>
                     </a:stretch>
@@ -31720,7 +31735,7 @@
                   <pic:spPr>
                     <a:xfrm>
                       <a:off x="0" y="0"/>
-                      <a:ext cx="1728000" cy="3741696"/>
+                      <a:ext cx="1655999" cy="3585790"/>
                     </a:xfrm>
                     <a:prstGeom prst="rect"/>
                   </pic:spPr>
@@ -31736,8 +31751,8 @@
       <w:r>
         <w:drawing>
           <wp:inline xmlns:a="http://schemas.openxmlformats.org/drawingml/2006/main" xmlns:pic="http://schemas.openxmlformats.org/drawingml/2006/picture">
-            <wp:extent cx="1728000" cy="3741696"/>
-            <wp:docPr id="2117811029" name="Picture 2117811029"/>
+            <wp:extent cx="1655999" cy="3585790"/>
+            <wp:docPr id="2117811086" name="Picture 2117811086"/>
             <wp:cNvGraphicFramePr>
               <a:graphicFrameLocks noChangeAspect="1"/>
             </wp:cNvGraphicFramePr>
@@ -31745,11 +31760,11 @@
               <a:graphicData uri="http://schemas.openxmlformats.org/drawingml/2006/picture">
                 <pic:pic>
                   <pic:nvPicPr>
-                    <pic:cNvPr id="0" name="p-edit-profile.png"/>
+                    <pic:cNvPr id="0" name="11-avatar-set.png"/>
                     <pic:cNvPicPr/>
                   </pic:nvPicPr>
                   <pic:blipFill>
-                    <a:blip r:embed="rId46"/>
+                    <a:blip r:embed="rId82"/>
                     <a:stretch>
                       <a:fillRect/>
                     </a:stretch>
@@ -31757,7 +31772,7 @@
                   <pic:spPr>
                     <a:xfrm>
                       <a:off x="0" y="0"/>
-                      <a:ext cx="1728000" cy="3741696"/>
+                      <a:ext cx="1655999" cy="3585790"/>
                     </a:xfrm>
                     <a:prstGeom prst="rect"/>
                   </pic:spPr>
@@ -31773,8 +31788,8 @@
       <w:r>
         <w:drawing>
           <wp:inline xmlns:a="http://schemas.openxmlformats.org/drawingml/2006/main" xmlns:pic="http://schemas.openxmlformats.org/drawingml/2006/picture">
-            <wp:extent cx="1728000" cy="3741696"/>
-            <wp:docPr id="2117811030" name="Picture 2117811030"/>
+            <wp:extent cx="1655999" cy="3585790"/>
+            <wp:docPr id="2117811087" name="Picture 2117811087"/>
             <wp:cNvGraphicFramePr>
               <a:graphicFrameLocks noChangeAspect="1"/>
             </wp:cNvGraphicFramePr>
@@ -31782,7 +31797,7 @@
               <a:graphicData uri="http://schemas.openxmlformats.org/drawingml/2006/picture">
                 <pic:pic>
                   <pic:nvPicPr>
-                    <pic:cNvPr id="0" name="p-settings.png"/>
+                    <pic:cNvPr id="0" name="image.png"/>
                     <pic:cNvPicPr/>
                   </pic:nvPicPr>
                   <pic:blipFill>
@@ -31794,7 +31809,7 @@
                   <pic:spPr>
                     <a:xfrm>
                       <a:off x="0" y="0"/>
-                      <a:ext cx="1728000" cy="3741696"/>
+                      <a:ext cx="1655999" cy="3585790"/>
                     </a:xfrm>
                     <a:prstGeom prst="rect"/>
                   </pic:spPr>
@@ -31816,13 +31831,7 @@
           <w:bCs/>
           <w:cs/>
         </w:rPr>
-        <w:t xml:space="preserve">ภาพที่ 4.11 </w:t>
-      </w:r>
-      <w:r>
-        <w:rPr>
-          <w:cs/>
-        </w:rPr>
-        <w:t>หน้าโปรไฟล์ แก้ไขข้อมูลส่วนตัว และการตั้งค่า</w:t>
+        <w:t>ภาพที่ 4.11 หน้าโปรไฟล์ที่มีรูป หน้าตั้งรูปและแก้ไขข้อมูลส่วนตัว และหน้าตั้งค่า</w:t>
       </w:r>
       <w:bookmarkEnd w:id="117"/>
     </w:p>
@@ -31835,7 +31844,7 @@
         <w:rPr>
           <w:cs/>
         </w:rPr>
-        <w:t>ผู้ใช้บริการแก้ไขชื่อ เบอร์โทรศัพท์ และรหัสนิสิตได้ ดูและเปลี่ยนพื้นที่ให้บริการเองได้ (ปกติระบบเลือกให้จาก GPS) และออกจากระบบได้ นอกจากนี้ปุ่ม "อยากขับวินด้วย?" ให้สมัครเป็นผู้ขับขี่จากบัญชีเดิมได้ทันที และผู้ที่เป็นผู้ขับขี่แล้วสลับระหว่างโหมดผู้โดยสารและผู้ขับขี่ได้ในบัญชีเดียว</w:t>
+        <w:t>ผู้ใช้บริการแก้ไขชื่อ เบอร์โทรศัพท์ และรหัสนิสิตได้ ดูและเปลี่ยนวิทยาเขตเองได้ (ปกติระบบเลือกให้จาก GPS) ตั้งรูปโปรไฟล์ได้ (แตะรูปแล้วเลือกกล้องหรือคลังรูป ระบบย่อรูปก่อนอัปโหลด และลบรูปได้) และออกจากระบบได้ นอกจากนี้ปุ่ม "อยากขับวินด้วย?" ให้สมัครเป็นผู้ขับขี่จากบัญชีเดิมได้ทันที และผู้ที่เป็นผู้ขับขี่แล้วสลับระหว่างโหมดผู้โดยสารและผู้ขับขี่ได้ในบัญชีเดียว</w:t>
       </w:r>
     </w:p>
     <w:p>
@@ -31940,7 +31949,7 @@
         <w:rPr>
           <w:cs/>
         </w:rPr>
-        <w:t>ปุ่มแจ้งเหตุที่ส่งพิกัดปัจจุบันไปยังผู้ดูแลระบบของพื้นที่ทันที</w:t>
+        <w:t>ปุ่มแจ้งเหตุที่ส่งพิกัดปัจจุบันไปยังผู้ดูแลระบบของวิทยาเขตทันที</w:t>
       </w:r>
     </w:p>
     <w:p>
@@ -31956,7 +31965,7 @@
         <w:rPr>
           <w:cs/>
         </w:rPr>
-        <w:t>เบอร์ฉุกเฉินของพื้นที่ เช่น รักษาความปลอดภัย มก. กำแพงแสน 034-351-151 และเบอร์ระดับประเทศ ได้แก่ ตำรวจ 191 และหน่วยแพทย์ฉุกเฉิน 1669</w:t>
+        <w:t>เบอร์ฉุกเฉินของวิทยาเขต เช่น รักษาความปลอดภัย มก. กำแพงแสน 034-351-151 และเบอร์ระดับประเทศ ได้แก่ ตำรวจ 191 และหน่วยแพทย์ฉุกเฉิน 1669</w:t>
       </w:r>
     </w:p>
     <w:p>
@@ -33841,7 +33850,7 @@
         <w:rPr>
           <w:cs/>
         </w:rPr>
-        <w:t>ผู้ดูแลเพิ่ม แก้ไข และลบสถานที่ในพื้นที่ให้บริการได้ ปักหมุดพิกัดบนแผนที่ให้ตรงกับสถานที่จริง และกำหนดสถานที่ยอดนิยมที่จะแสดงในหน้าแรกของผู้ใช้บริการ</w:t>
+        <w:t>ผู้ดูแลเพิ่ม แก้ไข และลบสถานที่ในวิทยาเขตได้ ปักหมุดพิกัดบนแผนที่ให้ตรงกับสถานที่จริง และกำหนดสถานที่ยอดนิยมที่จะแสดงในหน้าแรกของผู้ใช้บริการ</w:t>
       </w:r>
     </w:p>
     <w:p>
@@ -33856,7 +33865,7 @@
           <w:bCs/>
           <w:cs/>
         </w:rPr>
-        <w:t>4.1.3.5 หน้าตั้งค่าพื้นที่</w:t>
+        <w:t>4.1.3.5 หน้าตั้งค่าวิทยาเขต</w:t>
       </w:r>
     </w:p>
     <w:p>
@@ -33917,7 +33926,7 @@
         <w:rPr>
           <w:cs/>
         </w:rPr>
-        <w:t>หน้าตั้งค่าพื้นที่ให้บริการ</w:t>
+        <w:t>หน้าตั้งค่าวิทยาเขต</w:t>
       </w:r>
       <w:bookmarkEnd w:id="134"/>
     </w:p>
@@ -33930,7 +33939,7 @@
         <w:rPr>
           <w:cs/>
         </w:rPr>
-        <w:t>ผู้ดูแลกำหนดค่าต่าง ๆ ของพื้นที่ตนเองได้ ประกอบด้วย</w:t>
+        <w:t>ผู้ดูแลกำหนดค่าต่าง ๆ ของวิทยาเขตตนเองได้ ประกอบด้วย</w:t>
       </w:r>
     </w:p>
     <w:p>
@@ -33963,7 +33972,7 @@
         <w:rPr>
           <w:cs/>
         </w:rPr>
-        <w:t>ขอบเขตพื้นที่ ได้แก่ จุดกลาง รัศมีเขตเหมาจ่าย และรัศมีให้บริการ</w:t>
+        <w:t>ขอบเขตวิทยาเขต ได้แก่ จุดกลาง รัศมีเขตเหมาจ่าย และรัศมีให้บริการ</w:t>
       </w:r>
     </w:p>
     <w:p>
@@ -33995,7 +34004,7 @@
         <w:rPr>
           <w:cs/>
         </w:rPr>
-        <w:t>เบอร์ฉุกเฉินของพื้นที่</w:t>
+        <w:t>เบอร์ฉุกเฉินของวิทยาเขต</w:t>
       </w:r>
     </w:p>
     <w:p>
@@ -34010,7 +34019,7 @@
           <w:bCs/>
           <w:cs/>
         </w:rPr>
-        <w:t>4.1.3.6 หน้าจัดการพื้นที่และบัญชีผู้ดูแล</w:t>
+        <w:t>4.1.3.6 หน้าจัดการวิทยาเขตและบัญชีผู้ดูแล</w:t>
       </w:r>
     </w:p>
     <w:p>
@@ -34108,7 +34117,7 @@
         <w:rPr>
           <w:cs/>
         </w:rPr>
-        <w:t>หน้าจัดการพื้นที่และหน้าบัญชีผู้ดูแล (เฉพาะผู้ดูแลระบบสูงสุด)</w:t>
+        <w:t>หน้าจัดการวิทยาเขตและหน้าบัญชีผู้ดูแล (เฉพาะผู้ดูแลระบบสูงสุด)</w:t>
       </w:r>
       <w:bookmarkEnd w:id="135"/>
     </w:p>
@@ -34121,7 +34130,7 @@
         <w:rPr>
           <w:cs/>
         </w:rPr>
-        <w:t>ผู้ดูแลระบบสูงสุดสร้างพื้นที่ให้บริการใหม่ เปิดหรือปิดพื้นที่ และสร้างบัญชีผู้ดูแลพื้นที่ให้แต่ละพื้นที่ได้ ส่วนผู้ดูแลพื้นที่จะเห็นและจัดการได้เฉพาะข้อมูลของพื้นที่ตนเองเท่านั้น</w:t>
+        <w:t>ผู้ดูแลระบบสูงสุดสร้างวิทยาเขตใหม่ เปิดหรือปิดวิทยาเขต และสร้างบัญชีผู้ดูแลวิทยาเขตให้แต่ละวิทยาเขตได้ ส่วนผู้ดูแลวิทยาเขตจะเห็นและจัดการได้เฉพาะข้อมูลของวิทยาเขตตนเองเท่านั้น</w:t>
       </w:r>
     </w:p>
     <w:p>
@@ -34162,7 +34171,7 @@
           <w:bCs/>
           <w:cs/>
         </w:rPr>
-        <w:t>ตารางที่ 4.1 สรุปผลการทดสอบทุกชั้น (รอบวันที่ 20 ตุลาคม 2569)</w:t>
+        <w:t>ตารางที่ 4.1 สรุปผลการทดสอบทุกชั้น (รอบวันที่ 23 ตุลาคม 2569)</w:t>
       </w:r>
       <w:bookmarkEnd w:id="24"/>
     </w:p>
@@ -34381,7 +34390,7 @@
               <w:rPr>
                 <w:cs/>
               </w:rPr>
-              <w:t>9 ชุด 132 กรณี</w:t>
+              <w:t>10 ชุด 139 กรณี</w:t>
             </w:r>
           </w:p>
         </w:tc>
@@ -34489,7 +34498,7 @@
               <w:rPr>
                 <w:cs/>
               </w:rPr>
-              <w:t>5 ชุด 27 กรณี</w:t>
+              <w:t>5 ชุด 28 กรณี</w:t>
             </w:r>
           </w:p>
         </w:tc>
@@ -34514,7 +34523,7 @@
               <w:jc w:val="center"/>
             </w:pPr>
             <w:r>
-              <w:t>ผ่านทุกกรณี (36.1 วินาที)</w:t>
+              <w:t>ผ่านทุกกรณี</w:t>
             </w:r>
           </w:p>
         </w:tc>
@@ -34597,7 +34606,7 @@
               <w:rPr>
                 <w:cs/>
               </w:rPr>
-              <w:t>5,365 บรรทัด</w:t>
+              <w:t>5,479 บรรทัด</w:t>
             </w:r>
           </w:p>
         </w:tc>
@@ -34622,7 +34631,7 @@
               <w:jc w:val="center"/>
             </w:pPr>
             <w:r>
-              <w:t>ครอบคลุม 80.65%</w:t>
+              <w:t>ครอบคลุม 80.85%</w:t>
             </w:r>
           </w:p>
         </w:tc>
@@ -35353,7 +35362,7 @@
               <w:rPr>
                 <w:cs/>
               </w:rPr>
-              <w:t>หลายพื้นที่ สิทธิ์ผู้ดูแลพื้นที่ และการเงินของผู้ขับขี่</w:t>
+              <w:t>หลายวิทยาเขต สิทธิ์ผู้ดูแลวิทยาเขต และการเงินของผู้ขับขี่</w:t>
             </w:r>
           </w:p>
         </w:tc>
@@ -36084,7 +36093,7 @@
           </w:tcPr>
           <w:p>
             <w:r>
-              <w:t>รวม</w:t>
+              <w:t>test-profile</w:t>
             </w:r>
           </w:p>
         </w:tc>
@@ -36109,6 +36118,7 @@
               <w:rPr>
                 <w:cs/>
               </w:rPr>
+              <w:t>รูปโปรไฟล์: ตั้ง เปลี่ยน ลบ โหมดคนขับ และอีกฝ่ายในทริปเห็นรูป</w:t>
             </w:r>
           </w:p>
         </w:tc>
@@ -36133,7 +36143,114 @@
               <w:jc w:val="center"/>
             </w:pPr>
             <w:r>
-              <w:t>132</w:t>
+              <w:t>7</w:t>
+            </w:r>
+          </w:p>
+        </w:tc>
+        <w:tc>
+          <w:tcPr>
+            <w:tcW w:w="1190" w:type="dxa"/>
+            <w:tcBorders>
+              <w:top w:val="single" w:sz="4" w:space="0" w:color="000000"/>
+              <w:left w:val="single" w:sz="4" w:space="0" w:color="000000"/>
+              <w:bottom w:val="single" w:sz="4" w:space="0" w:color="000000"/>
+              <w:right w:val="single" w:sz="4" w:space="0" w:color="000000"/>
+            </w:tcBorders>
+            <w:tcMar>
+              <w:top w:w="40" w:type="dxa"/>
+              <w:left w:w="100" w:type="dxa"/>
+              <w:bottom w:w="40" w:type="dxa"/>
+              <w:right w:w="100" w:type="dxa"/>
+            </w:tcMar>
+          </w:tcPr>
+          <w:p>
+            <w:pPr>
+              <w:jc w:val="center"/>
+            </w:pPr>
+            <w:r>
+              <w:t>ผ่าน</w:t>
+            </w:r>
+          </w:p>
+        </w:tc>
+      </w:tr>
+      <w:tr>
+        <w:tblPrEx>
+          <w:tblCellMar>
+            <w:top w:w="0" w:type="dxa"/>
+            <w:bottom w:w="0" w:type="dxa"/>
+          </w:tblCellMar>
+        </w:tblPrEx>
+        <w:trPr>
+          <w:cantSplit/>
+        </w:trPr>
+        <w:tc>
+          <w:tcPr>
+            <w:tcW w:w="1814" w:type="dxa"/>
+            <w:tcBorders>
+              <w:top w:val="single" w:sz="4" w:space="0" w:color="000000"/>
+              <w:left w:val="single" w:sz="4" w:space="0" w:color="000000"/>
+              <w:bottom w:val="single" w:sz="4" w:space="0" w:color="000000"/>
+              <w:right w:val="single" w:sz="4" w:space="0" w:color="000000"/>
+            </w:tcBorders>
+            <w:tcMar>
+              <w:top w:w="40" w:type="dxa"/>
+              <w:left w:w="100" w:type="dxa"/>
+              <w:bottom w:w="40" w:type="dxa"/>
+              <w:right w:w="100" w:type="dxa"/>
+            </w:tcMar>
+          </w:tcPr>
+          <w:p>
+            <w:r>
+              <w:t>รวม</w:t>
+            </w:r>
+          </w:p>
+        </w:tc>
+        <w:tc>
+          <w:tcPr>
+            <w:tcW w:w="4649" w:type="dxa"/>
+            <w:tcBorders>
+              <w:top w:val="single" w:sz="4" w:space="0" w:color="000000"/>
+              <w:left w:val="single" w:sz="4" w:space="0" w:color="000000"/>
+              <w:bottom w:val="single" w:sz="4" w:space="0" w:color="000000"/>
+              <w:right w:val="single" w:sz="4" w:space="0" w:color="000000"/>
+            </w:tcBorders>
+            <w:tcMar>
+              <w:top w:w="40" w:type="dxa"/>
+              <w:left w:w="100" w:type="dxa"/>
+              <w:bottom w:w="40" w:type="dxa"/>
+              <w:right w:w="100" w:type="dxa"/>
+            </w:tcMar>
+          </w:tcPr>
+          <w:p>
+            <w:r>
+              <w:rPr>
+                <w:cs/>
+              </w:rPr>
+            </w:r>
+          </w:p>
+        </w:tc>
+        <w:tc>
+          <w:tcPr>
+            <w:tcW w:w="850" w:type="dxa"/>
+            <w:tcBorders>
+              <w:top w:val="single" w:sz="4" w:space="0" w:color="000000"/>
+              <w:left w:val="single" w:sz="4" w:space="0" w:color="000000"/>
+              <w:bottom w:val="single" w:sz="4" w:space="0" w:color="000000"/>
+              <w:right w:val="single" w:sz="4" w:space="0" w:color="000000"/>
+            </w:tcBorders>
+            <w:tcMar>
+              <w:top w:w="40" w:type="dxa"/>
+              <w:left w:w="100" w:type="dxa"/>
+              <w:bottom w:w="40" w:type="dxa"/>
+              <w:right w:w="100" w:type="dxa"/>
+            </w:tcMar>
+          </w:tcPr>
+          <w:p>
+            <w:pPr>
+              <w:jc w:val="center"/>
+            </w:pPr>
+            <w:r>
+              <w:t>139</w:t>
             </w:r>
           </w:p>
         </w:tc>
@@ -37569,6 +37686,114 @@
           </w:tcPr>
           <w:p>
             <w:r>
+              <w:t>TC-02-06</w:t>
+            </w:r>
+          </w:p>
+        </w:tc>
+        <w:tc>
+          <w:tcPr>
+            <w:tcW w:w="5386" w:type="dxa"/>
+            <w:tcBorders>
+              <w:top w:val="single" w:sz="4" w:space="0" w:color="000000"/>
+              <w:left w:val="single" w:sz="4" w:space="0" w:color="000000"/>
+              <w:bottom w:val="single" w:sz="4" w:space="0" w:color="000000"/>
+              <w:right w:val="single" w:sz="4" w:space="0" w:color="000000"/>
+            </w:tcBorders>
+            <w:tcMar>
+              <w:top w:w="40" w:type="dxa"/>
+              <w:left w:w="100" w:type="dxa"/>
+              <w:bottom w:w="40" w:type="dxa"/>
+              <w:right w:w="100" w:type="dxa"/>
+            </w:tcMar>
+          </w:tcPr>
+          <w:p>
+            <w:r>
+              <w:rPr>
+                <w:cs/>
+              </w:rPr>
+              <w:t>ตั้งรูปโปรไฟล์ → เห็นในหน้าโปรไฟล์ → ลบรูปแล้วกลับเป็นตัวอักษร</w:t>
+            </w:r>
+          </w:p>
+        </w:tc>
+        <w:tc>
+          <w:tcPr>
+            <w:tcW w:w="850" w:type="dxa"/>
+            <w:tcBorders>
+              <w:top w:val="single" w:sz="4" w:space="0" w:color="000000"/>
+              <w:left w:val="single" w:sz="4" w:space="0" w:color="000000"/>
+              <w:bottom w:val="single" w:sz="4" w:space="0" w:color="000000"/>
+              <w:right w:val="single" w:sz="4" w:space="0" w:color="000000"/>
+            </w:tcBorders>
+            <w:tcMar>
+              <w:top w:w="40" w:type="dxa"/>
+              <w:left w:w="100" w:type="dxa"/>
+              <w:bottom w:w="40" w:type="dxa"/>
+              <w:right w:w="100" w:type="dxa"/>
+            </w:tcMar>
+          </w:tcPr>
+          <w:p>
+            <w:pPr>
+              <w:jc w:val="center"/>
+            </w:pPr>
+            <w:r>
+              <w:t>ผ่าน</w:t>
+            </w:r>
+          </w:p>
+        </w:tc>
+        <w:tc>
+          <w:tcPr>
+            <w:tcW w:w="1020" w:type="dxa"/>
+            <w:tcBorders>
+              <w:top w:val="single" w:sz="4" w:space="0" w:color="000000"/>
+              <w:left w:val="single" w:sz="4" w:space="0" w:color="000000"/>
+              <w:bottom w:val="single" w:sz="4" w:space="0" w:color="000000"/>
+              <w:right w:val="single" w:sz="4" w:space="0" w:color="000000"/>
+            </w:tcBorders>
+            <w:tcMar>
+              <w:top w:w="40" w:type="dxa"/>
+              <w:left w:w="100" w:type="dxa"/>
+              <w:bottom w:w="40" w:type="dxa"/>
+              <w:right w:w="100" w:type="dxa"/>
+            </w:tcMar>
+          </w:tcPr>
+          <w:p>
+            <w:pPr>
+              <w:jc w:val="center"/>
+            </w:pPr>
+            <w:r>
+              <w:t>2.3 วิ</w:t>
+            </w:r>
+          </w:p>
+        </w:tc>
+      </w:tr>
+      <w:tr>
+        <w:tblPrEx>
+          <w:tblCellMar>
+            <w:top w:w="0" w:type="dxa"/>
+            <w:bottom w:w="0" w:type="dxa"/>
+          </w:tblCellMar>
+        </w:tblPrEx>
+        <w:trPr>
+          <w:cantSplit/>
+        </w:trPr>
+        <w:tc>
+          <w:tcPr>
+            <w:tcW w:w="1247" w:type="dxa"/>
+            <w:tcBorders>
+              <w:top w:val="single" w:sz="4" w:space="0" w:color="000000"/>
+              <w:left w:val="single" w:sz="4" w:space="0" w:color="000000"/>
+              <w:bottom w:val="single" w:sz="4" w:space="0" w:color="000000"/>
+              <w:right w:val="single" w:sz="4" w:space="0" w:color="000000"/>
+            </w:tcBorders>
+            <w:tcMar>
+              <w:top w:w="40" w:type="dxa"/>
+              <w:left w:w="100" w:type="dxa"/>
+              <w:bottom w:w="40" w:type="dxa"/>
+              <w:right w:w="100" w:type="dxa"/>
+            </w:tcMar>
+          </w:tcPr>
+          <w:p>
+            <w:r>
               <w:t>TC-03-01</w:t>
             </w:r>
           </w:p>
@@ -38216,7 +38441,7 @@
               <w:rPr>
                 <w:cs/>
               </w:rPr>
-              <w:t>แจ้งปัญหาหลังทริปจากหน้าประวัติ → ส่งสำเร็จ → แอดมินพื้นที่เห็นเคส</w:t>
+              <w:t>แจ้งปัญหาหลังทริปจากหน้าประวัติ → ส่งสำเร็จ → แอดมินวิทยาเขตเห็นเคส</w:t>
             </w:r>
           </w:p>
         </w:tc>
@@ -41187,6 +41412,222 @@
           </w:p>
         </w:tc>
       </w:tr>
+      <w:tr>
+        <w:tblPrEx>
+          <w:tblCellMar>
+            <w:top w:w="0" w:type="dxa"/>
+            <w:bottom w:w="0" w:type="dxa"/>
+          </w:tblCellMar>
+        </w:tblPrEx>
+        <w:trPr>
+          <w:cantSplit/>
+        </w:trPr>
+        <w:tc>
+          <w:tcPr>
+            <w:tcW w:w="1020" w:type="dxa"/>
+            <w:tcBorders>
+              <w:top w:val="single" w:sz="4" w:space="0" w:color="000000"/>
+              <w:left w:val="single" w:sz="4" w:space="0" w:color="000000"/>
+              <w:bottom w:val="single" w:sz="4" w:space="0" w:color="000000"/>
+              <w:right w:val="single" w:sz="4" w:space="0" w:color="000000"/>
+            </w:tcBorders>
+            <w:tcMar>
+              <w:top w:w="40" w:type="dxa"/>
+              <w:left w:w="100" w:type="dxa"/>
+              <w:bottom w:w="40" w:type="dxa"/>
+              <w:right w:w="100" w:type="dxa"/>
+            </w:tcMar>
+          </w:tcPr>
+          <w:p>
+            <w:r>
+              <w:t>BUG-7</w:t>
+            </w:r>
+          </w:p>
+        </w:tc>
+        <w:tc>
+          <w:tcPr>
+            <w:tcW w:w="907" w:type="dxa"/>
+            <w:tcBorders>
+              <w:top w:val="single" w:sz="4" w:space="0" w:color="000000"/>
+              <w:left w:val="single" w:sz="4" w:space="0" w:color="000000"/>
+              <w:bottom w:val="single" w:sz="4" w:space="0" w:color="000000"/>
+              <w:right w:val="single" w:sz="4" w:space="0" w:color="000000"/>
+            </w:tcBorders>
+            <w:tcMar>
+              <w:top w:w="40" w:type="dxa"/>
+              <w:left w:w="100" w:type="dxa"/>
+              <w:bottom w:w="40" w:type="dxa"/>
+              <w:right w:w="100" w:type="dxa"/>
+            </w:tcMar>
+          </w:tcPr>
+          <w:p>
+            <w:r>
+              <w:rPr>
+                <w:cs/>
+              </w:rPr>
+              <w:t>กลาง</w:t>
+            </w:r>
+          </w:p>
+        </w:tc>
+        <w:tc>
+          <w:tcPr>
+            <w:tcW w:w="4536" w:type="dxa"/>
+            <w:tcBorders>
+              <w:top w:val="single" w:sz="4" w:space="0" w:color="000000"/>
+              <w:left w:val="single" w:sz="4" w:space="0" w:color="000000"/>
+              <w:bottom w:val="single" w:sz="4" w:space="0" w:color="000000"/>
+              <w:right w:val="single" w:sz="4" w:space="0" w:color="000000"/>
+            </w:tcBorders>
+            <w:tcMar>
+              <w:top w:w="40" w:type="dxa"/>
+              <w:left w:w="100" w:type="dxa"/>
+              <w:bottom w:w="40" w:type="dxa"/>
+              <w:right w:w="100" w:type="dxa"/>
+            </w:tcMar>
+          </w:tcPr>
+          <w:p>
+            <w:pPr>
+              <w:jc w:val="center"/>
+            </w:pPr>
+            <w:r>
+              <w:t>สคริปต์ build แอป Android เลือก Java ผิดรุ่น (path ของ JDK หาย backslash จึงหาไม่เจอ) Gradle ล้ม</w:t>
+            </w:r>
+          </w:p>
+        </w:tc>
+        <w:tc>
+          <w:tcPr>
+            <w:tcW w:w="2041" w:type="dxa"/>
+            <w:tcBorders>
+              <w:top w:val="single" w:sz="4" w:space="0" w:color="000000"/>
+              <w:left w:val="single" w:sz="4" w:space="0" w:color="000000"/>
+              <w:bottom w:val="single" w:sz="4" w:space="0" w:color="000000"/>
+              <w:right w:val="single" w:sz="4" w:space="0" w:color="000000"/>
+            </w:tcBorders>
+            <w:tcMar>
+              <w:top w:w="40" w:type="dxa"/>
+              <w:left w:w="100" w:type="dxa"/>
+              <w:bottom w:w="40" w:type="dxa"/>
+              <w:right w:w="100" w:type="dxa"/>
+            </w:tcMar>
+          </w:tcPr>
+          <w:p>
+            <w:pPr>
+              <w:jc w:val="center"/>
+            </w:pPr>
+            <w:r>
+              <w:t>แก้แล้ว: แก้ path และทดสอบ build ผ่าน</w:t>
+            </w:r>
+          </w:p>
+        </w:tc>
+      </w:tr>
+      <w:tr>
+        <w:tblPrEx>
+          <w:tblCellMar>
+            <w:top w:w="0" w:type="dxa"/>
+            <w:bottom w:w="0" w:type="dxa"/>
+          </w:tblCellMar>
+        </w:tblPrEx>
+        <w:trPr>
+          <w:cantSplit/>
+        </w:trPr>
+        <w:tc>
+          <w:tcPr>
+            <w:tcW w:w="1020" w:type="dxa"/>
+            <w:tcBorders>
+              <w:top w:val="single" w:sz="4" w:space="0" w:color="000000"/>
+              <w:left w:val="single" w:sz="4" w:space="0" w:color="000000"/>
+              <w:bottom w:val="single" w:sz="4" w:space="0" w:color="000000"/>
+              <w:right w:val="single" w:sz="4" w:space="0" w:color="000000"/>
+            </w:tcBorders>
+            <w:tcMar>
+              <w:top w:w="40" w:type="dxa"/>
+              <w:left w:w="100" w:type="dxa"/>
+              <w:bottom w:w="40" w:type="dxa"/>
+              <w:right w:w="100" w:type="dxa"/>
+            </w:tcMar>
+          </w:tcPr>
+          <w:p>
+            <w:r>
+              <w:t>BUG-8</w:t>
+            </w:r>
+          </w:p>
+        </w:tc>
+        <w:tc>
+          <w:tcPr>
+            <w:tcW w:w="907" w:type="dxa"/>
+            <w:tcBorders>
+              <w:top w:val="single" w:sz="4" w:space="0" w:color="000000"/>
+              <w:left w:val="single" w:sz="4" w:space="0" w:color="000000"/>
+              <w:bottom w:val="single" w:sz="4" w:space="0" w:color="000000"/>
+              <w:right w:val="single" w:sz="4" w:space="0" w:color="000000"/>
+            </w:tcBorders>
+            <w:tcMar>
+              <w:top w:w="40" w:type="dxa"/>
+              <w:left w:w="100" w:type="dxa"/>
+              <w:bottom w:w="40" w:type="dxa"/>
+              <w:right w:w="100" w:type="dxa"/>
+            </w:tcMar>
+          </w:tcPr>
+          <w:p>
+            <w:r>
+              <w:rPr>
+                <w:cs/>
+              </w:rPr>
+              <w:t>ต่ำ</w:t>
+            </w:r>
+          </w:p>
+        </w:tc>
+        <w:tc>
+          <w:tcPr>
+            <w:tcW w:w="4536" w:type="dxa"/>
+            <w:tcBorders>
+              <w:top w:val="single" w:sz="4" w:space="0" w:color="000000"/>
+              <w:left w:val="single" w:sz="4" w:space="0" w:color="000000"/>
+              <w:bottom w:val="single" w:sz="4" w:space="0" w:color="000000"/>
+              <w:right w:val="single" w:sz="4" w:space="0" w:color="000000"/>
+            </w:tcBorders>
+            <w:tcMar>
+              <w:top w:w="40" w:type="dxa"/>
+              <w:left w:w="100" w:type="dxa"/>
+              <w:bottom w:w="40" w:type="dxa"/>
+              <w:right w:w="100" w:type="dxa"/>
+            </w:tcMar>
+          </w:tcPr>
+          <w:p>
+            <w:pPr>
+              <w:jc w:val="center"/>
+            </w:pPr>
+            <w:r>
+              <w:t>กุญแจ Firebase ใน .env มีเครื่องหมาย ' เกินท้าย ทำให้ API อ่านกุญแจไม่ได้ (Docker Compose ตัดเฉพาะตัวแรก)</w:t>
+            </w:r>
+          </w:p>
+        </w:tc>
+        <w:tc>
+          <w:tcPr>
+            <w:tcW w:w="2041" w:type="dxa"/>
+            <w:tcBorders>
+              <w:top w:val="single" w:sz="4" w:space="0" w:color="000000"/>
+              <w:left w:val="single" w:sz="4" w:space="0" w:color="000000"/>
+              <w:bottom w:val="single" w:sz="4" w:space="0" w:color="000000"/>
+              <w:right w:val="single" w:sz="4" w:space="0" w:color="000000"/>
+            </w:tcBorders>
+            <w:tcMar>
+              <w:top w:w="40" w:type="dxa"/>
+              <w:left w:w="100" w:type="dxa"/>
+              <w:bottom w:w="40" w:type="dxa"/>
+              <w:right w:w="100" w:type="dxa"/>
+            </w:tcMar>
+          </w:tcPr>
+          <w:p>
+            <w:pPr>
+              <w:jc w:val="center"/>
+            </w:pPr>
+            <w:r>
+              <w:t>แก้แล้ว: API ตัดอัญประกาศที่หัวท้ายเอง คู่มืออัปเดต</w:t>
+            </w:r>
+          </w:p>
+        </w:tc>
+      </w:tr>
     </w:tbl>
     <w:p>
       <w:pPr>
@@ -47391,7 +47832,7 @@
         <w:rPr>
           <w:cs/>
         </w:rPr>
-        <w:t>จากการดำเนินงานปัญหาพิเศษเรื่องระบบเรียกวินมอเตอร์ไซค์ภายในมหาวิทยาลัยเกษตรศาสตร์ วิทยาเขตกำแพงแสน ผ่าน KU VIN ได้ระบบที่ตรงตามจุดประสงค์ที่ตั้งไว้ ดังนี้</w:t>
+        <w:t>จากการดำเนินงานปัญหาพิเศษเรื่องระบบเรียกวินมอเตอร์ไซค์ภายในมหาวิทยาลัยเกษตรศาสตร์ วิทยาเขตกำแพงแสน ผ่าน KUVIN ได้ระบบที่ตรงตามจุดประสงค์ที่ตั้งไว้ ดังนี้</w:t>
       </w:r>
     </w:p>
     <w:p>
@@ -47405,7 +47846,7 @@
       <w:r>
         <w:t>5.1.1</w:t>
         <w:tab/>
-        <w:t>พัฒนาแอปพลิเคชันสำหรับเรียกใช้บริการวินรถจักรยานยนต์ได้สำเร็จ ระบบประกอบด้วยแอปพลิเคชันสำหรับผู้ใช้บริการและผู้ขับขี่ที่ใช้บัญชีเดียวสลับโหมดได้ ใช้งานได้ทั้งบนเว็บเบราว์เซอร์และแอป Android และ Web Dashboard สำหรับผู้ดูแลระบบ ติดตั้งใช้งานจริงบน VPS ของ Hostinger ที่ https://kuvinn.tech พร้อมระบบติดตั้งอัตโนมัติจาก GitHub Actions</w:t>
+        <w:t>พัฒนาแอปพลิเคชันสำหรับเรียกใช้บริการวินรถจักรยานยนต์ได้สำเร็จ ระบบประกอบด้วยแอปพลิเคชันสำหรับผู้ใช้บริการและผู้ขับขี่ที่ใช้บัญชีเดียวสลับโหมดได้ ใช้งานได้ทั้งบนเว็บเบราว์เซอร์ แอป Android (ติดตั้งจากไฟล์ APK) และติดตั้งลงหน้าจอโฮมบน iPhone พร้อม Web Dashboard สำหรับผู้ดูแลระบบ ติดตั้งใช้งานจริงบน VPS ของ Hostinger ที่ https://kuvinn.tech ด้วยระบบติดตั้งอัตโนมัติจาก GitHub Actions และแจ้งเตือนเด้งบนมือถือใช้ได้จริง</w:t>
       </w:r>
     </w:p>
     <w:p>
@@ -47447,7 +47888,7 @@
         <w:rPr>
           <w:cs/>
         </w:rPr>
-        <w:t>ระบบเสนองานให้ผู้ขับขี่ตามลำดับคิวทีละคนอย่างเป็นธรรม คำนวณค่าโดยสารตามอัตราของพื้นที่โดยอัตโนมัติ และรองรับการเรียกใช้พร้อมกันหลายคำขอโดยไม่เสนองานซ้อน ซึ่งยืนยันได้จากชุดทดสอบอัตโนมัติ</w:t>
+        <w:t>ระบบเสนองานให้ผู้ขับขี่ตามลำดับคิวทีละคนอย่างเป็นธรรม คำนวณค่าโดยสารตามอัตราของวิทยาเขตโดยอัตโนมัติ และรองรับการเรียกใช้พร้อมกันหลายคำขอโดยไม่เสนองานซ้อน ซึ่งยืนยันได้จากชุดทดสอบอัตโนมัติ</w:t>
       </w:r>
     </w:p>
     <w:p>
@@ -47461,7 +47902,7 @@
       <w:r>
         <w:t>5.1.4</w:t>
         <w:tab/>
-        <w:t>ระบบเพิ่มความปลอดภัยด้วยการยืนยันเบอร์โทรศัพท์และเซลฟี่ของผู้โดยสาร การยืนยันตัวตนผู้ขับขี่ก่อนรับงาน เอกสารเป็นไฟล์ส่วนตัว การซ่อนเบอร์โทรเมื่อทริปจบ การแชตภายในแอป การแชร์ลิงก์ติดตามทริป การแจ้งปัญหาหลังทริป การให้คะแนนทั้งสองฝ่าย และปุ่มแจ้งเหตุฉุกเฉินที่แจ้งผู้ดูแลระบบได้ทันที</w:t>
+        <w:t>ระบบเพิ่มความปลอดภัยด้วยการยืนยันเบอร์โทรศัพท์และเซลฟี่ของผู้โดยสาร การยืนยันตัวตนผู้ขับขี่ก่อนรับงาน เอกสารเป็นไฟล์ส่วนตัว การซ่อนเบอร์โทรเมื่อทริปจบ การแชตภายในแอป การแชร์ลิงก์ติดตามทริป การแจ้งปัญหาหลังทริป รูปโปรไฟล์ของทั้งสองฝ่าย การให้คะแนนทั้งสองฝ่าย และปุ่มแจ้งเหตุฉุกเฉินที่แจ้งผู้ดูแลระบบได้ทันที</w:t>
       </w:r>
     </w:p>
     <w:p>
@@ -47496,7 +47937,7 @@
       <w:r>
         <w:t>5.1.6</w:t>
         <w:tab/>
-        <w:t>ชุดทดสอบอัตโนมัติ 132 กรณีของ API และ 27 กรณีของ E2E ผ่านทั้งหมด ค่าครอบคลุมของโค้ด API 80.65% และ SonarQube ให้ผ่าน Quality Gate ส่วนผลความพึงพอใจของผู้ใช้งานจริง (SUS และแบบสอบถาม) ยังไม่ได้เก็บ จึงยังไม่สรุปผลในส่วนนี้</w:t>
+        <w:t>ชุดทดสอบอัตโนมัติ 139 กรณีของ API และ 28 กรณีของ E2E ผ่านทั้งหมด ค่าครอบคลุมของโค้ด API 80.85% และ SonarQube ให้ผ่าน Quality Gate ส่วนผลความพึงพอใจของผู้ใช้งานจริง (SUS และแบบสอบถาม) ยังไม่ได้เก็บ จึงยังไม่สรุปผลในส่วนนี้</w:t>
       </w:r>
     </w:p>
     <w:p>
@@ -47509,7 +47950,7 @@
         <w:rPr>
           <w:cs/>
         </w:rPr>
-        <w:t>นอกจากนี้ ระบบยังออกแบบให้รองรับหลายพื้นที่ให้บริการ โดยแต่ละพื้นที่กำหนดค่าโดยสาร ขอบเขต และเบอร์ฉุกเฉินของตนเองได้ ทำให้สามารถนำระบบไปขยายใช้กับวินในพื้นที่อื่นได้โดยไม่ต้องแก้ไขโค้ด</w:t>
+        <w:t>นอกจากนี้ ระบบยังออกแบบให้รองรับหลายวิทยาเขต โดยแต่ละวิทยาเขตกำหนดค่าโดยสาร ขอบเขต และเบอร์ฉุกเฉินของตนเองได้ ทำให้สามารถนำระบบไปขยายใช้กับวินในวิทยาเขตอื่นได้โดยไม่ต้องแก้ไขโค้ด</w:t>
       </w:r>
     </w:p>
     <w:p>
@@ -47651,7 +48092,7 @@
         <w:rPr>
           <w:cs/>
         </w:rPr>
-        <w:t>การติดตั้งระบบจริงต้องเปลี่ยนจาก Railway มาเป็น VPS ของ Hostinger เพื่อควบคุมค่าใช้จ่ายและใช้โดเมนของตนเอง ต้องตั้งค่า DNS ใบรับรอง HTTPS Nginx และระบบติดตั้งอัตโนมัติเอง ระหว่างทางพบปัญหา เช่น การตรวจสุขภาพรอจนหมดเวลาเมื่อ HTTPS ยังไม่พร้อม (แก้ด้วยการกำหนดเวลารอ) และ Docker Desktop บนเครื่องพัฒนาค้างเมื่อหน่วยความจำและพื้นที่ดิสก์ไม่พอ นอกจากนี้ OTP ยังเป็นโหมดทดสอบเพราะยังไม่ได้ซื้อบริการ SMS และยังไม่ได้ทดสอบกับผู้ใช้งานจริง</w:t>
+        <w:t>การติดตั้งระบบจริงต้องเปลี่ยนจาก Railway มาเป็น VPS ของ Hostinger เพื่อควบคุมค่าใช้จ่ายและใช้โดเมนของตนเอง ต้องตั้งค่า DNS ใบรับรอง HTTPS Nginx และระบบติดตั้งอัตโนมัติเอง ระหว่างทางพบปัญหา เช่น การตรวจสุขภาพรอจนหมดเวลาเมื่อ HTTPS ยังไม่พร้อม (แก้ด้วยการกำหนดเวลารอ) และ Docker Desktop บนเครื่องพัฒนาค้างเมื่อหน่วยความจำและวิทยาเขตดิสก์ไม่พอ นอกจากนี้ OTP ยังเป็นโหมดทดสอบเพราะยังไม่ได้ซื้อบริการ SMS และยังไม่ได้ทดสอบกับผู้ใช้งานจริง ตอนตั้งค่าการแจ้งเตือนเด้งบนมือถือพบว่ากุญแจ Firebase ที่วางในไฟล์ตั้งค่ามีเครื่องหมายอัญประกาศเกินทำให้อ่านไม่ได้ จึงแก้โค้ดให้ทนต่อกรณีนี้และเพิ่มคำสั่งตรวจกุญแจในคู่มือ ส่วนการ build แอป Android เจอปัญหา Gradle ใช้ Java ผิดรุ่น (รุ่นใหม่เกินไป) ซึ่งสืบสาเหตุได้ว่าเป็นข้อผิดพลาดของ path ในสคริปต์ build เอง และแก้ไขแล้ว</w:t>
       </w:r>
     </w:p>
     <w:p>
@@ -47695,7 +48136,7 @@
           <w:bCs/>
           <w:cs/>
         </w:rPr>
-        <w:t>เชื่อมต่อผู้ให้บริการ SMS เพื่อส่งรหัส OTP จริง และปิดโหมดทดสอบ</w:t>
+        <w:t>เชื่อมต่อผู้ให้บริการ SMS เพื่อส่งรหัส OTP จริง และปิดโหมดทดสอบ (ผู้จัดทำสำรวจผู้ให้บริการในประเทศแล้ว แพ็กเกจเล็กสุดราว 1,500 บาทต่อประมาณ 3,000 ข้อความ หรือราว 0.49 บาทต่อข้อความ ตามหน้าราคาของผู้ให้บริการ ณ ตุลาคม 2569 จึงยังไม่ได้ซื้อ และใช้การเข้าสู่ระบบด้วย Google และอีเมลเป็นทางเลือกที่ไม่มีค่าใช้จ่าย)</w:t>
       </w:r>
     </w:p>
     <w:p>
@@ -47713,7 +48154,7 @@
           <w:bCs/>
           <w:cs/>
         </w:rPr>
-        <w:t>เข้าสู่ระบบด้วยบัญชีของมหาวิทยาลัย (KU ALL Login) และการยืนยันตัวตนด้วยบัตรประชาชน (eKYC) ซึ่งต้องขอสิทธิ์จากมหาวิทยาลัยหรือผู้ให้บริการภายนอก ยังไม่ได้ทำในปัญหาพิเศษนี้</w:t>
+        <w:t>แจ้งเตือนบน iPhone (Web Push) และการเผยแพร่แอปบน Google Play / App Store ซึ่งต้องใช้บัญชีนักพัฒนาของแต่ละแพลตฟอร์ม และการเซ็นแอปด้วยคีย์ของเจ้าของ</w:t>
       </w:r>
     </w:p>
     <w:p>
@@ -47731,7 +48172,7 @@
           <w:bCs/>
           <w:cs/>
         </w:rPr>
-        <w:t>เปิดใช้การตรวจสลิปโอนเงินกับผู้ให้บริการจริง และแอป Android ฉบับเผยแพร่ที่ลงลายเซ็นดิจิทัล พร้อมการเปิดหน้าที่เกี่ยวข้องเมื่อกดการแจ้งเตือน</w:t>
+        <w:t>เข้าสู่ระบบด้วยบัญชีของมหาวิทยาลัย (KU ALL Login) และการยืนยันตัวตนด้วยบัตรประชาชน (eKYC) ซึ่งต้องขอสิทธิ์จากมหาวิทยาลัยหรือผู้ให้บริการภายนอก ยังไม่ได้ทำในปัญหาพิเศษนี้</w:t>
       </w:r>
     </w:p>
     <w:p>
@@ -47749,7 +48190,7 @@
           <w:bCs/>
           <w:cs/>
         </w:rPr>
-        <w:t>หน้ารายงานสรุปสำหรับผู้ดูแลระบบ เช่น สถิติการใช้บริการรายสัปดาห์และรายเดือน และการปรับหน้าจอ Web Dashboard ทีละหน้าให้ใช้งานง่ายขึ้นต่อจากการปรับธีมในรอบนี้</w:t>
+        <w:t>เปิดใช้การตรวจสลิปโอนเงินกับผู้ให้บริการจริง และแอป Android ฉบับเผยแพร่ที่ลงลายเซ็นดิจิทัล พร้อมการเปิดหน้าที่เกี่ยวข้องเมื่อกดการแจ้งเตือน</w:t>
       </w:r>
     </w:p>
     <w:p>
@@ -47767,7 +48208,7 @@
           <w:bCs/>
           <w:cs/>
         </w:rPr>
-        <w:t>นโยบายความเป็นส่วนตัวตาม พ.ร.บ. คุ้มครองข้อมูลส่วนบุคคล (PDPA) เนื่องจากระบบจัดเก็บเบอร์โทรศัพท์ ตำแหน่ง เซลฟี่ และเอกสารยืนยันตัวตน รวมถึงแผนสำรองข้อมูลนอกเครื่องเซิร์ฟเวอร์</w:t>
+        <w:t>หน้ารายงานสรุปสำหรับผู้ดูแลระบบ เช่น สถิติการใช้บริการรายสัปดาห์และรายเดือน และการปรับหน้าจอ Web Dashboard ทีละหน้าให้ใช้งานง่ายขึ้นต่อจากการปรับธีมในรอบนี้</w:t>
       </w:r>
     </w:p>
     <w:p>
@@ -47785,7 +48226,7 @@
           <w:bCs/>
           <w:cs/>
         </w:rPr>
-        <w:t>ขอบเขตพื้นที่แบบรูปหลายเหลี่ยม (Polygon) ด้วย PostGIS และติดตั้งเซิร์ฟเวอร์ OSRM และแผนที่ของตนเอง</w:t>
+        <w:t>นโยบายความเป็นส่วนตัวตาม พ.ร.บ. คุ้มครองข้อมูลส่วนบุคคล (PDPA) เนื่องจากระบบจัดเก็บเบอร์โทรศัพท์ ตำแหน่ง เซลฟี่ และเอกสารยืนยันตัวตน รวมถึงแผนสำรองข้อมูลนอกเครื่องเซิร์ฟเวอร์</w:t>
       </w:r>
     </w:p>
     <w:p>
@@ -47803,7 +48244,7 @@
           <w:bCs/>
           <w:cs/>
         </w:rPr>
-        <w:t>ชุดทดสอบอัตโนมัติฝั่งหน้าจอระดับหน่วย (Unit Test) เพื่อวัดค่าครอบคลุมของโค้ดฝั่ง React ได้ การทดสอบภาระ (Load Test) และการเก็บผลการประเมินจากผู้ใช้งานจริง</w:t>
+        <w:t>ขอบเขตวิทยาเขตแบบรูปหลายเหลี่ยม (Polygon) ด้วย PostGIS และติดตั้งเซิร์ฟเวอร์ OSRM และแผนที่ของตนเอง</w:t>
       </w:r>
     </w:p>
     <w:p>
@@ -47821,6 +48262,24 @@
           <w:bCs/>
           <w:cs/>
         </w:rPr>
+        <w:t>ชุดทดสอบอัตโนมัติฝั่งหน้าจอระดับหน่วย (Unit Test) เพื่อวัดค่าครอบคลุมของโค้ดฝั่ง React ได้ การทดสอบภาระ (Load Test) และการเก็บผลการประเมินจากผู้ใช้งานจริง</w:t>
+      </w:r>
+    </w:p>
+    <w:p>
+      <w:pPr>
+        <w:pStyle w:val="a4"/>
+        <w:numPr>
+          <w:ilvl w:val="0"/>
+          <w:numId w:val="2"/>
+        </w:numPr>
+        <w:jc w:val="thaiDistribute"/>
+      </w:pPr>
+      <w:r>
+        <w:rPr>
+          <w:b/>
+          <w:bCs/>
+          <w:cs/>
+        </w:rPr>
         <w:t>ฟีเจอร์ที่ตัดออกในรอบนี้และเก็บไว้ต่อยอด ได้แก่ บทบาทหัวหน้าวินและการตั้งเป้าหมายรายได้ของผู้ขับขี่</w:t>
       </w:r>
     </w:p>
@@ -48204,7 +48663,7 @@
         <w:rPr>
           <w:cs/>
         </w:rPr>
-        <w:t>ผู้ใช้งานเข้าใช้ระบบได้ 2 ช่องทาง ได้แก่ เปิดผ่านเว็บเบราว์เซอร์ที่ https://kuvinn.tech หรือติดตั้งแอป KU VIN บนโทรศัพท์ระบบ Android (ไฟล์ติดตั้งสำหรับทดสอบ) ผู้ดูแลระบบเข้า Web Dashboard ที่ https://admin.kuvinn.tech</w:t>
+        <w:t>ผู้ใช้งานเข้าใช้ระบบได้ 3 ช่องทาง ได้แก่ (1) เปิดผ่านเว็บเบราว์เซอร์ที่ https://kuvinn.tech (2) ติดตั้งแอป KUVIN บนโทรศัพท์ Android โดยโหลดไฟล์ติดตั้ง (APK) จากหน้า Releases ของโครงการที่ https://github.com/Nawaphorn47/KUVIN/releases แล้วเปิดไฟล์ อนุญาต "ติดตั้งจากแหล่งที่ไม่รู้จัก" และกดอนุญาตตำแหน่ง กล้อง และการแจ้งเตือนเมื่อแอปถาม และ (3) บน iPhone เปิดเว็บแอปใน Safari กดแชร์ แล้วเลือก "เพิ่มลงในหน้าจอโฮม" ผู้ดูแลระบบเข้า Web Dashboard ที่ https://admin.kuvinn.tech</w:t>
       </w:r>
     </w:p>
     <w:p>
@@ -49101,7 +49560,7 @@
         <w:rPr>
           <w:cs/>
         </w:rPr>
-        <w:t>กรอกชื่อ-นามสกุล เบอร์โทรศัพท์ รหัสผ่าน พื้นที่ให้บริการ หมายเลขวิน ทะเบียนรถ และหมายเลขพร้อมเพย์</w:t>
+        <w:t>กรอกชื่อ-นามสกุล เบอร์โทรศัพท์ รหัสผ่าน วิทยาเขต หมายเลขวิน ทะเบียนรถ และหมายเลขพร้อมเพย์</w:t>
       </w:r>
     </w:p>
     <w:p>
@@ -50510,7 +50969,7 @@
         <w:rPr>
           <w:cs/>
         </w:rPr>
-        <w:t>ข.7 การตั้งค่าพื้นที่ให้บริการ</w:t>
+        <w:t>ข.7 การตั้งค่าวิทยาเขต</w:t>
       </w:r>
       <w:bookmarkEnd w:id="190"/>
     </w:p>
@@ -50532,7 +50991,7 @@
         <w:rPr>
           <w:cs/>
         </w:rPr>
-        <w:t>เปิดเมนูตั้งค่าพื้นที่</w:t>
+        <w:t>เปิดเมนูตั้งค่าวิทยาเขต</w:t>
       </w:r>
     </w:p>
     <w:p>
@@ -50553,7 +51012,7 @@
         <w:rPr>
           <w:cs/>
         </w:rPr>
-        <w:t>แก้ไขชื่อและโลโก้ ขอบเขตพื้นที่ ค่าโดยสาร และเบอร์ฉุกเฉินตามต้องการ แล้วกดบันทึก</w:t>
+        <w:t>แก้ไขชื่อและโลโก้ ขอบเขตวิทยาเขต ค่าโดยสาร และเบอร์ฉุกเฉินตามต้องการ แล้วกดบันทึก</w:t>
       </w:r>
     </w:p>
     <w:p>
@@ -50614,7 +51073,7 @@
         <w:rPr>
           <w:cs/>
         </w:rPr>
-        <w:t>ขั้นตอนการตั้งค่าพื้นที่ให้บริการ</w:t>
+        <w:t>ขั้นตอนการตั้งค่าวิทยาเขต</w:t>
       </w:r>
       <w:bookmarkEnd w:id="191"/>
     </w:p>
@@ -50628,7 +51087,7 @@
         <w:rPr>
           <w:cs/>
         </w:rPr>
-        <w:t>ข.8 การจัดการพื้นที่และบัญชีผู้ดูแล (ผู้ดูแลระบบสูงสุด)</w:t>
+        <w:t>ข.8 การจัดการวิทยาเขตและบัญชีผู้ดูแล (ผู้ดูแลระบบสูงสุด)</w:t>
       </w:r>
       <w:bookmarkEnd w:id="192"/>
     </w:p>
@@ -50650,7 +51109,7 @@
         <w:rPr>
           <w:cs/>
         </w:rPr>
-        <w:t>เปิดเมนูพื้นที่ทั้งหมด กดสร้างพื้นที่ใหม่ แล้วกรอกรหัสพื้นที่ ชื่อ จุดกลาง และค่าโดยสาร</w:t>
+        <w:t>เปิดเมนูวิทยาเขตทั้งหมด กดสร้างวิทยาเขตใหม่ แล้วกรอกรหัสวิทยาเขต ชื่อ จุดกลาง และค่าโดยสาร</w:t>
       </w:r>
     </w:p>
     <w:p>
@@ -50671,7 +51130,7 @@
         <w:rPr>
           <w:cs/>
         </w:rPr>
-        <w:t>เปิดเมนูบัญชีผู้ดูแล กดเพิ่มบัญชี เลือกบทบาทและพื้นที่ที่ดูแล แล้วกดบันทึก</w:t>
+        <w:t>เปิดเมนูบัญชีผู้ดูแล กดเพิ่มบัญชี เลือกบทบาทและวิทยาเขตที่ดูแล แล้วกดบันทึก</w:t>
       </w:r>
     </w:p>
     <w:p>
@@ -50769,7 +51228,7 @@
         <w:rPr>
           <w:cs/>
         </w:rPr>
-        <w:t>ขั้นตอนการจัดการพื้นที่และบัญชีผู้ดูแล</w:t>
+        <w:t>ขั้นตอนการจัดการวิทยาเขตและบัญชีผู้ดูแล</w:t>
       </w:r>
       <w:bookmarkEnd w:id="193"/>
     </w:p>
@@ -53202,7 +53661,7 @@
         <w:rPr>
           <w:cs/>
         </w:rPr>
-        <w:t>ระบบเรียกวินมอเตอร์ไซค์ภายในมหาวิทยาลัยเกษตรศาสตร์ วิทยาเขตกำแพงแสน ผ่าน KU VIN</w:t>
+        <w:t>ระบบเรียกวินมอเตอร์ไซค์ภายในมหาวิทยาลัยเกษตรศาสตร์ วิทยาเขตกำแพงแสน ผ่าน KUVIN</w:t>
       </w:r>
     </w:p>
     <w:p>
@@ -53217,7 +53676,7 @@
         <w:tab/>
       </w:r>
       <w:r>
-        <w:t>Motorcycle Taxi Booking System for Kasetsart University Kamphaeng Saen Campus via KU VIN</w:t>
+        <w:t>Motorcycle Taxi Booking System for Kasetsart University Kamphaeng Saen Campus via KUVIN</w:t>
       </w:r>
     </w:p>
     <w:p>
@@ -53366,6 +53825,26 @@
     </w:p>
   </w:endnote>
 </w:endnotes>
+</file>
+
+<file path=word/footer1.xml><?xml version="1.0" encoding="utf-8"?>
+<w:ftr xmlns:m="http://schemas.openxmlformats.org/officeDocument/2006/math" xmlns:mc="http://schemas.openxmlformats.org/markup-compatibility/2006" xmlns:mo="http://schemas.microsoft.com/office/mac/office/2008/main" xmlns:mv="urn:schemas-microsoft-com:mac:vml" xmlns:o="urn:schemas-microsoft-com:office:office" xmlns:r="http://schemas.openxmlformats.org/officeDocument/2006/relationships" xmlns:v="urn:schemas-microsoft-com:vml" xmlns:w10="urn:schemas-microsoft-com:office:word" xmlns:w14="http://schemas.microsoft.com/office/word/2010/wordml" xmlns:w="http://schemas.openxmlformats.org/wordprocessingml/2006/main" xmlns:wne="http://schemas.microsoft.com/office/word/2006/wordml" xmlns:wp14="http://schemas.microsoft.com/office/word/2010/wordprocessingDrawing" xmlns:wp="http://schemas.openxmlformats.org/drawingml/2006/wordprocessingDrawing" xmlns:wpc="http://schemas.microsoft.com/office/word/2010/wordprocessingCanvas" xmlns:wpg="http://schemas.microsoft.com/office/word/2010/wordprocessingGroup" xmlns:wpi="http://schemas.microsoft.com/office/word/2010/wordprocessingInk" xmlns:wps="http://schemas.microsoft.com/office/word/2010/wordprocessingShape" mc:Ignorable="w14 wp14">
+  <w:p>
+    <w:pPr>
+      <w:pStyle w:val="Footer"/>
+    </w:pPr>
+  </w:p>
+</w:ftr>
+</file>
+
+<file path=word/footer2.xml><?xml version="1.0" encoding="utf-8"?>
+<w:ftr xmlns:m="http://schemas.openxmlformats.org/officeDocument/2006/math" xmlns:mc="http://schemas.openxmlformats.org/markup-compatibility/2006" xmlns:mo="http://schemas.microsoft.com/office/mac/office/2008/main" xmlns:mv="urn:schemas-microsoft-com:mac:vml" xmlns:o="urn:schemas-microsoft-com:office:office" xmlns:r="http://schemas.openxmlformats.org/officeDocument/2006/relationships" xmlns:v="urn:schemas-microsoft-com:vml" xmlns:w10="urn:schemas-microsoft-com:office:word" xmlns:w14="http://schemas.microsoft.com/office/word/2010/wordml" xmlns:w="http://schemas.openxmlformats.org/wordprocessingml/2006/main" xmlns:wne="http://schemas.microsoft.com/office/word/2006/wordml" xmlns:wp14="http://schemas.microsoft.com/office/word/2010/wordprocessingDrawing" xmlns:wp="http://schemas.openxmlformats.org/drawingml/2006/wordprocessingDrawing" xmlns:wpc="http://schemas.microsoft.com/office/word/2010/wordprocessingCanvas" xmlns:wpg="http://schemas.microsoft.com/office/word/2010/wordprocessingGroup" xmlns:wpi="http://schemas.microsoft.com/office/word/2010/wordprocessingInk" xmlns:wps="http://schemas.microsoft.com/office/word/2010/wordprocessingShape" mc:Ignorable="w14 wp14">
+  <w:p>
+    <w:pPr>
+      <w:pStyle w:val="Footer"/>
+    </w:pPr>
+  </w:p>
+</w:ftr>
 </file>
 
 <file path=word/footnotes.xml><?xml version="1.0" encoding="utf-8"?>
@@ -53445,6 +53924,16 @@
     <w:r>
       <w:fldChar w:fldCharType="end"/>
     </w:r>
+  </w:p>
+</w:hdr>
+</file>
+
+<file path=word/header4.xml><?xml version="1.0" encoding="utf-8"?>
+<w:hdr xmlns:m="http://schemas.openxmlformats.org/officeDocument/2006/math" xmlns:mc="http://schemas.openxmlformats.org/markup-compatibility/2006" xmlns:mo="http://schemas.microsoft.com/office/mac/office/2008/main" xmlns:mv="urn:schemas-microsoft-com:mac:vml" xmlns:o="urn:schemas-microsoft-com:office:office" xmlns:r="http://schemas.openxmlformats.org/officeDocument/2006/relationships" xmlns:v="urn:schemas-microsoft-com:vml" xmlns:w10="urn:schemas-microsoft-com:office:word" xmlns:w14="http://schemas.microsoft.com/office/word/2010/wordml" xmlns:w="http://schemas.openxmlformats.org/wordprocessingml/2006/main" xmlns:wne="http://schemas.microsoft.com/office/word/2006/wordml" xmlns:wp14="http://schemas.microsoft.com/office/word/2010/wordprocessingDrawing" xmlns:wp="http://schemas.openxmlformats.org/drawingml/2006/wordprocessingDrawing" xmlns:wpc="http://schemas.microsoft.com/office/word/2010/wordprocessingCanvas" xmlns:wpg="http://schemas.microsoft.com/office/word/2010/wordprocessingGroup" xmlns:wpi="http://schemas.microsoft.com/office/word/2010/wordprocessingInk" xmlns:wps="http://schemas.microsoft.com/office/word/2010/wordprocessingShape" mc:Ignorable="w14 wp14">
+  <w:p>
+    <w:pPr>
+      <w:pStyle w:val="Header"/>
+    </w:pPr>
   </w:p>
 </w:hdr>
 </file>

</xml_diff>